<commit_message>
feat(m3): intégration du lexer JavaCC de M2 dans Partie 7
</commit_message>
<xml_diff>
--- a/docs/Rapport_Technique.docx
+++ b/docs/Rapport_Technique.docx
@@ -701,16 +701,1399 @@
     </w:p>
     <w:p>
       <w:pPr>
-        <w:shd w:fill="FFF2CC" w:val="clear"/>
-        <w:spacing w:after="200"/>
+        <w:spacing w:after="160"/>
       </w:pPr>
       <w:r>
         <w:rPr>
           <w:i/>
           <w:iCs/>
-          <w:color w:val="7F6000"/>
-        </w:rPr>
-        <w:t xml:space="preserve">À COMPLÉTER — Membre 2 — définir les tokens EMAIL, PHONE, DATE, AMOUNT, PERSON, WORD, OTHER et présenter les règles lexicales JavaCC (extraits du fichier .jj).</w:t>
+          <w:color w:val="555555"/>
+        </w:rPr>
+        <w:t xml:space="preserve">Responsable : Membre 2 — spécification complète dans grammar/Anonymizer.jj.</w:t>
+      </w:r>
+    </w:p>
+    <w:p>
+      <w:pPr>
+        <w:pStyle w:val="Heading2"/>
+      </w:pPr>
+      <w:r>
+        <w:t xml:space="preserve">4.1 Objectif et types de tokens</w:t>
+      </w:r>
+    </w:p>
+    <w:p>
+      <w:pPr>
+        <w:spacing w:after="160"/>
+      </w:pPr>
+      <w:r>
+        <w:t xml:space="preserve">L'analyse lexicale découpe le texte d'entrée en tokens et attribue à chacun un type. Sept types utiles sont définis, plus des tokens auxiliaires privés (préfixe #) qui ne servent que de briques aux règles ci-dessous :</w:t>
+      </w:r>
+    </w:p>
+    <w:tbl>
+      <w:tblPr>
+        <w:tblW w:type="dxa" w:w="9360"/>
+        <w:tblBorders>
+          <w:top w:val="single" w:color="auto" w:sz="4"/>
+          <w:left w:val="single" w:color="auto" w:sz="4"/>
+          <w:bottom w:val="single" w:color="auto" w:sz="4"/>
+          <w:right w:val="single" w:color="auto" w:sz="4"/>
+          <w:insideH w:val="single" w:color="auto" w:sz="4"/>
+          <w:insideV w:val="single" w:color="auto" w:sz="4"/>
+        </w:tblBorders>
+      </w:tblPr>
+      <w:tblGrid>
+        <w:gridCol w:w="3120"/>
+        <w:gridCol w:w="3120"/>
+        <w:gridCol w:w="3120"/>
+      </w:tblGrid>
+      <w:tr>
+        <w:tc>
+          <w:tcPr>
+            <w:tcW w:type="dxa" w:w="3120"/>
+            <w:tcBorders>
+              <w:top w:val="single" w:color="CCCCCC" w:sz="1"/>
+              <w:left w:val="single" w:color="CCCCCC" w:sz="1"/>
+              <w:bottom w:val="single" w:color="CCCCCC" w:sz="1"/>
+              <w:right w:val="single" w:color="CCCCCC" w:sz="1"/>
+            </w:tcBorders>
+            <w:shd w:fill="1F3864" w:val="clear"/>
+            <w:tcMar>
+              <w:top w:type="dxa" w:w="80"/>
+              <w:left w:type="dxa" w:w="120"/>
+              <w:bottom w:type="dxa" w:w="80"/>
+              <w:right w:type="dxa" w:w="120"/>
+            </w:tcMar>
+          </w:tcPr>
+          <w:p>
+            <w:r>
+              <w:rPr>
+                <w:b/>
+                <w:bCs/>
+                <w:color w:val="FFFFFF"/>
+                <w:sz w:val="20"/>
+                <w:szCs w:val="20"/>
+              </w:rPr>
+              <w:t xml:space="preserve">Type</w:t>
+            </w:r>
+          </w:p>
+        </w:tc>
+        <w:tc>
+          <w:tcPr>
+            <w:tcW w:type="dxa" w:w="3120"/>
+            <w:tcBorders>
+              <w:top w:val="single" w:color="CCCCCC" w:sz="1"/>
+              <w:left w:val="single" w:color="CCCCCC" w:sz="1"/>
+              <w:bottom w:val="single" w:color="CCCCCC" w:sz="1"/>
+              <w:right w:val="single" w:color="CCCCCC" w:sz="1"/>
+            </w:tcBorders>
+            <w:shd w:fill="1F3864" w:val="clear"/>
+            <w:tcMar>
+              <w:top w:type="dxa" w:w="80"/>
+              <w:left w:type="dxa" w:w="120"/>
+              <w:bottom w:type="dxa" w:w="80"/>
+              <w:right w:type="dxa" w:w="120"/>
+            </w:tcMar>
+          </w:tcPr>
+          <w:p>
+            <w:r>
+              <w:rPr>
+                <w:b/>
+                <w:bCs/>
+                <w:color w:val="FFFFFF"/>
+                <w:sz w:val="20"/>
+                <w:szCs w:val="20"/>
+              </w:rPr>
+              <w:t xml:space="preserve">Rôle</w:t>
+            </w:r>
+          </w:p>
+        </w:tc>
+        <w:tc>
+          <w:tcPr>
+            <w:tcW w:type="dxa" w:w="3120"/>
+            <w:tcBorders>
+              <w:top w:val="single" w:color="CCCCCC" w:sz="1"/>
+              <w:left w:val="single" w:color="CCCCCC" w:sz="1"/>
+              <w:bottom w:val="single" w:color="CCCCCC" w:sz="1"/>
+              <w:right w:val="single" w:color="CCCCCC" w:sz="1"/>
+            </w:tcBorders>
+            <w:shd w:fill="1F3864" w:val="clear"/>
+            <w:tcMar>
+              <w:top w:type="dxa" w:w="80"/>
+              <w:left w:type="dxa" w:w="120"/>
+              <w:bottom w:type="dxa" w:w="80"/>
+              <w:right w:type="dxa" w:w="120"/>
+            </w:tcMar>
+          </w:tcPr>
+          <w:p>
+            <w:r>
+              <w:rPr>
+                <w:b/>
+                <w:bCs/>
+                <w:color w:val="FFFFFF"/>
+                <w:sz w:val="20"/>
+                <w:szCs w:val="20"/>
+              </w:rPr>
+              <w:t xml:space="preserve">Marqueur</w:t>
+            </w:r>
+          </w:p>
+        </w:tc>
+      </w:tr>
+      <w:tr>
+        <w:tc>
+          <w:tcPr>
+            <w:tcW w:type="dxa" w:w="3120"/>
+            <w:tcBorders>
+              <w:top w:val="single" w:color="CCCCCC" w:sz="1"/>
+              <w:left w:val="single" w:color="CCCCCC" w:sz="1"/>
+              <w:bottom w:val="single" w:color="CCCCCC" w:sz="1"/>
+              <w:right w:val="single" w:color="CCCCCC" w:sz="1"/>
+            </w:tcBorders>
+            <w:tcMar>
+              <w:top w:type="dxa" w:w="80"/>
+              <w:left w:type="dxa" w:w="120"/>
+              <w:bottom w:type="dxa" w:w="80"/>
+              <w:right w:type="dxa" w:w="120"/>
+            </w:tcMar>
+          </w:tcPr>
+          <w:p>
+            <w:r>
+              <w:rPr>
+                <w:b w:val="false"/>
+                <w:bCs w:val="false"/>
+                <w:sz w:val="20"/>
+                <w:szCs w:val="20"/>
+              </w:rPr>
+              <w:t xml:space="preserve">EMAIL</w:t>
+            </w:r>
+          </w:p>
+        </w:tc>
+        <w:tc>
+          <w:tcPr>
+            <w:tcW w:type="dxa" w:w="3120"/>
+            <w:tcBorders>
+              <w:top w:val="single" w:color="CCCCCC" w:sz="1"/>
+              <w:left w:val="single" w:color="CCCCCC" w:sz="1"/>
+              <w:bottom w:val="single" w:color="CCCCCC" w:sz="1"/>
+              <w:right w:val="single" w:color="CCCCCC" w:sz="1"/>
+            </w:tcBorders>
+            <w:tcMar>
+              <w:top w:type="dxa" w:w="80"/>
+              <w:left w:type="dxa" w:w="120"/>
+              <w:bottom w:type="dxa" w:w="80"/>
+              <w:right w:type="dxa" w:w="120"/>
+            </w:tcMar>
+          </w:tcPr>
+          <w:p>
+            <w:r>
+              <w:rPr>
+                <w:b w:val="false"/>
+                <w:bCs w:val="false"/>
+                <w:sz w:val="20"/>
+                <w:szCs w:val="20"/>
+              </w:rPr>
+              <w:t xml:space="preserve">Adresse électronique</w:t>
+            </w:r>
+          </w:p>
+        </w:tc>
+        <w:tc>
+          <w:tcPr>
+            <w:tcW w:type="dxa" w:w="3120"/>
+            <w:tcBorders>
+              <w:top w:val="single" w:color="CCCCCC" w:sz="1"/>
+              <w:left w:val="single" w:color="CCCCCC" w:sz="1"/>
+              <w:bottom w:val="single" w:color="CCCCCC" w:sz="1"/>
+              <w:right w:val="single" w:color="CCCCCC" w:sz="1"/>
+            </w:tcBorders>
+            <w:tcMar>
+              <w:top w:type="dxa" w:w="80"/>
+              <w:left w:type="dxa" w:w="120"/>
+              <w:bottom w:type="dxa" w:w="80"/>
+              <w:right w:type="dxa" w:w="120"/>
+            </w:tcMar>
+          </w:tcPr>
+          <w:p>
+            <w:r>
+              <w:rPr>
+                <w:b w:val="false"/>
+                <w:bCs w:val="false"/>
+                <w:sz w:val="20"/>
+                <w:szCs w:val="20"/>
+              </w:rPr>
+              <w:t xml:space="preserve">&lt;EMAIL&gt;</w:t>
+            </w:r>
+          </w:p>
+        </w:tc>
+      </w:tr>
+      <w:tr>
+        <w:tc>
+          <w:tcPr>
+            <w:tcW w:type="dxa" w:w="3120"/>
+            <w:tcBorders>
+              <w:top w:val="single" w:color="CCCCCC" w:sz="1"/>
+              <w:left w:val="single" w:color="CCCCCC" w:sz="1"/>
+              <w:bottom w:val="single" w:color="CCCCCC" w:sz="1"/>
+              <w:right w:val="single" w:color="CCCCCC" w:sz="1"/>
+            </w:tcBorders>
+            <w:tcMar>
+              <w:top w:type="dxa" w:w="80"/>
+              <w:left w:type="dxa" w:w="120"/>
+              <w:bottom w:type="dxa" w:w="80"/>
+              <w:right w:type="dxa" w:w="120"/>
+            </w:tcMar>
+          </w:tcPr>
+          <w:p>
+            <w:r>
+              <w:rPr>
+                <w:b w:val="false"/>
+                <w:bCs w:val="false"/>
+                <w:sz w:val="20"/>
+                <w:szCs w:val="20"/>
+              </w:rPr>
+              <w:t xml:space="preserve">PHONE</w:t>
+            </w:r>
+          </w:p>
+        </w:tc>
+        <w:tc>
+          <w:tcPr>
+            <w:tcW w:type="dxa" w:w="3120"/>
+            <w:tcBorders>
+              <w:top w:val="single" w:color="CCCCCC" w:sz="1"/>
+              <w:left w:val="single" w:color="CCCCCC" w:sz="1"/>
+              <w:bottom w:val="single" w:color="CCCCCC" w:sz="1"/>
+              <w:right w:val="single" w:color="CCCCCC" w:sz="1"/>
+            </w:tcBorders>
+            <w:tcMar>
+              <w:top w:type="dxa" w:w="80"/>
+              <w:left w:type="dxa" w:w="120"/>
+              <w:bottom w:type="dxa" w:w="80"/>
+              <w:right w:type="dxa" w:w="120"/>
+            </w:tcMar>
+          </w:tcPr>
+          <w:p>
+            <w:r>
+              <w:rPr>
+                <w:b w:val="false"/>
+                <w:bCs w:val="false"/>
+                <w:sz w:val="20"/>
+                <w:szCs w:val="20"/>
+              </w:rPr>
+              <w:t xml:space="preserve">Numéro de téléphone (SN / international)</w:t>
+            </w:r>
+          </w:p>
+        </w:tc>
+        <w:tc>
+          <w:tcPr>
+            <w:tcW w:type="dxa" w:w="3120"/>
+            <w:tcBorders>
+              <w:top w:val="single" w:color="CCCCCC" w:sz="1"/>
+              <w:left w:val="single" w:color="CCCCCC" w:sz="1"/>
+              <w:bottom w:val="single" w:color="CCCCCC" w:sz="1"/>
+              <w:right w:val="single" w:color="CCCCCC" w:sz="1"/>
+            </w:tcBorders>
+            <w:tcMar>
+              <w:top w:type="dxa" w:w="80"/>
+              <w:left w:type="dxa" w:w="120"/>
+              <w:bottom w:type="dxa" w:w="80"/>
+              <w:right w:type="dxa" w:w="120"/>
+            </w:tcMar>
+          </w:tcPr>
+          <w:p>
+            <w:r>
+              <w:rPr>
+                <w:b w:val="false"/>
+                <w:bCs w:val="false"/>
+                <w:sz w:val="20"/>
+                <w:szCs w:val="20"/>
+              </w:rPr>
+              <w:t xml:space="preserve">&lt;TELEPHONE&gt;</w:t>
+            </w:r>
+          </w:p>
+        </w:tc>
+      </w:tr>
+      <w:tr>
+        <w:tc>
+          <w:tcPr>
+            <w:tcW w:type="dxa" w:w="3120"/>
+            <w:tcBorders>
+              <w:top w:val="single" w:color="CCCCCC" w:sz="1"/>
+              <w:left w:val="single" w:color="CCCCCC" w:sz="1"/>
+              <w:bottom w:val="single" w:color="CCCCCC" w:sz="1"/>
+              <w:right w:val="single" w:color="CCCCCC" w:sz="1"/>
+            </w:tcBorders>
+            <w:tcMar>
+              <w:top w:type="dxa" w:w="80"/>
+              <w:left w:type="dxa" w:w="120"/>
+              <w:bottom w:type="dxa" w:w="80"/>
+              <w:right w:type="dxa" w:w="120"/>
+            </w:tcMar>
+          </w:tcPr>
+          <w:p>
+            <w:r>
+              <w:rPr>
+                <w:b w:val="false"/>
+                <w:bCs w:val="false"/>
+                <w:sz w:val="20"/>
+                <w:szCs w:val="20"/>
+              </w:rPr>
+              <w:t xml:space="preserve">DATE</w:t>
+            </w:r>
+          </w:p>
+        </w:tc>
+        <w:tc>
+          <w:tcPr>
+            <w:tcW w:type="dxa" w:w="3120"/>
+            <w:tcBorders>
+              <w:top w:val="single" w:color="CCCCCC" w:sz="1"/>
+              <w:left w:val="single" w:color="CCCCCC" w:sz="1"/>
+              <w:bottom w:val="single" w:color="CCCCCC" w:sz="1"/>
+              <w:right w:val="single" w:color="CCCCCC" w:sz="1"/>
+            </w:tcBorders>
+            <w:tcMar>
+              <w:top w:type="dxa" w:w="80"/>
+              <w:left w:type="dxa" w:w="120"/>
+              <w:bottom w:type="dxa" w:w="80"/>
+              <w:right w:type="dxa" w:w="120"/>
+            </w:tcMar>
+          </w:tcPr>
+          <w:p>
+            <w:r>
+              <w:rPr>
+                <w:b w:val="false"/>
+                <w:bCs w:val="false"/>
+                <w:sz w:val="20"/>
+                <w:szCs w:val="20"/>
+              </w:rPr>
+              <w:t xml:space="preserve">Date (numérique ou en toutes lettres)</w:t>
+            </w:r>
+          </w:p>
+        </w:tc>
+        <w:tc>
+          <w:tcPr>
+            <w:tcW w:type="dxa" w:w="3120"/>
+            <w:tcBorders>
+              <w:top w:val="single" w:color="CCCCCC" w:sz="1"/>
+              <w:left w:val="single" w:color="CCCCCC" w:sz="1"/>
+              <w:bottom w:val="single" w:color="CCCCCC" w:sz="1"/>
+              <w:right w:val="single" w:color="CCCCCC" w:sz="1"/>
+            </w:tcBorders>
+            <w:tcMar>
+              <w:top w:type="dxa" w:w="80"/>
+              <w:left w:type="dxa" w:w="120"/>
+              <w:bottom w:type="dxa" w:w="80"/>
+              <w:right w:type="dxa" w:w="120"/>
+            </w:tcMar>
+          </w:tcPr>
+          <w:p>
+            <w:r>
+              <w:rPr>
+                <w:b w:val="false"/>
+                <w:bCs w:val="false"/>
+                <w:sz w:val="20"/>
+                <w:szCs w:val="20"/>
+              </w:rPr>
+              <w:t xml:space="preserve">&lt;DATE&gt;</w:t>
+            </w:r>
+          </w:p>
+        </w:tc>
+      </w:tr>
+      <w:tr>
+        <w:tc>
+          <w:tcPr>
+            <w:tcW w:type="dxa" w:w="3120"/>
+            <w:tcBorders>
+              <w:top w:val="single" w:color="CCCCCC" w:sz="1"/>
+              <w:left w:val="single" w:color="CCCCCC" w:sz="1"/>
+              <w:bottom w:val="single" w:color="CCCCCC" w:sz="1"/>
+              <w:right w:val="single" w:color="CCCCCC" w:sz="1"/>
+            </w:tcBorders>
+            <w:tcMar>
+              <w:top w:type="dxa" w:w="80"/>
+              <w:left w:type="dxa" w:w="120"/>
+              <w:bottom w:type="dxa" w:w="80"/>
+              <w:right w:type="dxa" w:w="120"/>
+            </w:tcMar>
+          </w:tcPr>
+          <w:p>
+            <w:r>
+              <w:rPr>
+                <w:b w:val="false"/>
+                <w:bCs w:val="false"/>
+                <w:sz w:val="20"/>
+                <w:szCs w:val="20"/>
+              </w:rPr>
+              <w:t xml:space="preserve">AMOUNT</w:t>
+            </w:r>
+          </w:p>
+        </w:tc>
+        <w:tc>
+          <w:tcPr>
+            <w:tcW w:type="dxa" w:w="3120"/>
+            <w:tcBorders>
+              <w:top w:val="single" w:color="CCCCCC" w:sz="1"/>
+              <w:left w:val="single" w:color="CCCCCC" w:sz="1"/>
+              <w:bottom w:val="single" w:color="CCCCCC" w:sz="1"/>
+              <w:right w:val="single" w:color="CCCCCC" w:sz="1"/>
+            </w:tcBorders>
+            <w:tcMar>
+              <w:top w:type="dxa" w:w="80"/>
+              <w:left w:type="dxa" w:w="120"/>
+              <w:bottom w:type="dxa" w:w="80"/>
+              <w:right w:type="dxa" w:w="120"/>
+            </w:tcMar>
+          </w:tcPr>
+          <w:p>
+            <w:r>
+              <w:rPr>
+                <w:b w:val="false"/>
+                <w:bCs w:val="false"/>
+                <w:sz w:val="20"/>
+                <w:szCs w:val="20"/>
+              </w:rPr>
+              <w:t xml:space="preserve">Montant financier en FCFA</w:t>
+            </w:r>
+          </w:p>
+        </w:tc>
+        <w:tc>
+          <w:tcPr>
+            <w:tcW w:type="dxa" w:w="3120"/>
+            <w:tcBorders>
+              <w:top w:val="single" w:color="CCCCCC" w:sz="1"/>
+              <w:left w:val="single" w:color="CCCCCC" w:sz="1"/>
+              <w:bottom w:val="single" w:color="CCCCCC" w:sz="1"/>
+              <w:right w:val="single" w:color="CCCCCC" w:sz="1"/>
+            </w:tcBorders>
+            <w:tcMar>
+              <w:top w:type="dxa" w:w="80"/>
+              <w:left w:type="dxa" w:w="120"/>
+              <w:bottom w:type="dxa" w:w="80"/>
+              <w:right w:type="dxa" w:w="120"/>
+            </w:tcMar>
+          </w:tcPr>
+          <w:p>
+            <w:r>
+              <w:rPr>
+                <w:b w:val="false"/>
+                <w:bCs w:val="false"/>
+                <w:sz w:val="20"/>
+                <w:szCs w:val="20"/>
+              </w:rPr>
+              <w:t xml:space="preserve">&lt;MONTANT&gt;</w:t>
+            </w:r>
+          </w:p>
+        </w:tc>
+      </w:tr>
+      <w:tr>
+        <w:tc>
+          <w:tcPr>
+            <w:tcW w:type="dxa" w:w="3120"/>
+            <w:tcBorders>
+              <w:top w:val="single" w:color="CCCCCC" w:sz="1"/>
+              <w:left w:val="single" w:color="CCCCCC" w:sz="1"/>
+              <w:bottom w:val="single" w:color="CCCCCC" w:sz="1"/>
+              <w:right w:val="single" w:color="CCCCCC" w:sz="1"/>
+            </w:tcBorders>
+            <w:tcMar>
+              <w:top w:type="dxa" w:w="80"/>
+              <w:left w:type="dxa" w:w="120"/>
+              <w:bottom w:type="dxa" w:w="80"/>
+              <w:right w:type="dxa" w:w="120"/>
+            </w:tcMar>
+          </w:tcPr>
+          <w:p>
+            <w:r>
+              <w:rPr>
+                <w:b w:val="false"/>
+                <w:bCs w:val="false"/>
+                <w:sz w:val="20"/>
+                <w:szCs w:val="20"/>
+              </w:rPr>
+              <w:t xml:space="preserve">TITLE</w:t>
+            </w:r>
+          </w:p>
+        </w:tc>
+        <w:tc>
+          <w:tcPr>
+            <w:tcW w:type="dxa" w:w="3120"/>
+            <w:tcBorders>
+              <w:top w:val="single" w:color="CCCCCC" w:sz="1"/>
+              <w:left w:val="single" w:color="CCCCCC" w:sz="1"/>
+              <w:bottom w:val="single" w:color="CCCCCC" w:sz="1"/>
+              <w:right w:val="single" w:color="CCCCCC" w:sz="1"/>
+            </w:tcBorders>
+            <w:tcMar>
+              <w:top w:type="dxa" w:w="80"/>
+              <w:left w:type="dxa" w:w="120"/>
+              <w:bottom w:type="dxa" w:w="80"/>
+              <w:right w:type="dxa" w:w="120"/>
+            </w:tcMar>
+          </w:tcPr>
+          <w:p>
+            <w:r>
+              <w:rPr>
+                <w:b w:val="false"/>
+                <w:bCs w:val="false"/>
+                <w:sz w:val="20"/>
+                <w:szCs w:val="20"/>
+              </w:rPr>
+              <w:t xml:space="preserve">Civilité (Monsieur, Madame, M., …)</w:t>
+            </w:r>
+          </w:p>
+        </w:tc>
+        <w:tc>
+          <w:tcPr>
+            <w:tcW w:type="dxa" w:w="3120"/>
+            <w:tcBorders>
+              <w:top w:val="single" w:color="CCCCCC" w:sz="1"/>
+              <w:left w:val="single" w:color="CCCCCC" w:sz="1"/>
+              <w:bottom w:val="single" w:color="CCCCCC" w:sz="1"/>
+              <w:right w:val="single" w:color="CCCCCC" w:sz="1"/>
+            </w:tcBorders>
+            <w:tcMar>
+              <w:top w:type="dxa" w:w="80"/>
+              <w:left w:type="dxa" w:w="120"/>
+              <w:bottom w:type="dxa" w:w="80"/>
+              <w:right w:type="dxa" w:w="120"/>
+            </w:tcMar>
+          </w:tcPr>
+          <w:p>
+            <w:r>
+              <w:rPr>
+                <w:b w:val="false"/>
+                <w:bCs w:val="false"/>
+                <w:sz w:val="20"/>
+                <w:szCs w:val="20"/>
+              </w:rPr>
+              <w:t xml:space="preserve">supprimé</w:t>
+            </w:r>
+          </w:p>
+        </w:tc>
+      </w:tr>
+      <w:tr>
+        <w:tc>
+          <w:tcPr>
+            <w:tcW w:type="dxa" w:w="3120"/>
+            <w:tcBorders>
+              <w:top w:val="single" w:color="CCCCCC" w:sz="1"/>
+              <w:left w:val="single" w:color="CCCCCC" w:sz="1"/>
+              <w:bottom w:val="single" w:color="CCCCCC" w:sz="1"/>
+              <w:right w:val="single" w:color="CCCCCC" w:sz="1"/>
+            </w:tcBorders>
+            <w:tcMar>
+              <w:top w:type="dxa" w:w="80"/>
+              <w:left w:type="dxa" w:w="120"/>
+              <w:bottom w:type="dxa" w:w="80"/>
+              <w:right w:type="dxa" w:w="120"/>
+            </w:tcMar>
+          </w:tcPr>
+          <w:p>
+            <w:r>
+              <w:rPr>
+                <w:b w:val="false"/>
+                <w:bCs w:val="false"/>
+                <w:sz w:val="20"/>
+                <w:szCs w:val="20"/>
+              </w:rPr>
+              <w:t xml:space="preserve">PERSON</w:t>
+            </w:r>
+          </w:p>
+        </w:tc>
+        <w:tc>
+          <w:tcPr>
+            <w:tcW w:type="dxa" w:w="3120"/>
+            <w:tcBorders>
+              <w:top w:val="single" w:color="CCCCCC" w:sz="1"/>
+              <w:left w:val="single" w:color="CCCCCC" w:sz="1"/>
+              <w:bottom w:val="single" w:color="CCCCCC" w:sz="1"/>
+              <w:right w:val="single" w:color="CCCCCC" w:sz="1"/>
+            </w:tcBorders>
+            <w:tcMar>
+              <w:top w:type="dxa" w:w="80"/>
+              <w:left w:type="dxa" w:w="120"/>
+              <w:bottom w:type="dxa" w:w="80"/>
+              <w:right w:type="dxa" w:w="120"/>
+            </w:tcMar>
+          </w:tcPr>
+          <w:p>
+            <w:r>
+              <w:rPr>
+                <w:b w:val="false"/>
+                <w:bCs w:val="false"/>
+                <w:sz w:val="20"/>
+                <w:szCs w:val="20"/>
+              </w:rPr>
+              <w:t xml:space="preserve">Nom propre (majuscule + minuscules)</w:t>
+            </w:r>
+          </w:p>
+        </w:tc>
+        <w:tc>
+          <w:tcPr>
+            <w:tcW w:type="dxa" w:w="3120"/>
+            <w:tcBorders>
+              <w:top w:val="single" w:color="CCCCCC" w:sz="1"/>
+              <w:left w:val="single" w:color="CCCCCC" w:sz="1"/>
+              <w:bottom w:val="single" w:color="CCCCCC" w:sz="1"/>
+              <w:right w:val="single" w:color="CCCCCC" w:sz="1"/>
+            </w:tcBorders>
+            <w:tcMar>
+              <w:top w:type="dxa" w:w="80"/>
+              <w:left w:type="dxa" w:w="120"/>
+              <w:bottom w:type="dxa" w:w="80"/>
+              <w:right w:type="dxa" w:w="120"/>
+            </w:tcMar>
+          </w:tcPr>
+          <w:p>
+            <w:r>
+              <w:rPr>
+                <w:b w:val="false"/>
+                <w:bCs w:val="false"/>
+                <w:sz w:val="20"/>
+                <w:szCs w:val="20"/>
+              </w:rPr>
+              <w:t xml:space="preserve">&lt;PERSONNE&gt;</w:t>
+            </w:r>
+          </w:p>
+        </w:tc>
+      </w:tr>
+      <w:tr>
+        <w:tc>
+          <w:tcPr>
+            <w:tcW w:type="dxa" w:w="3120"/>
+            <w:tcBorders>
+              <w:top w:val="single" w:color="CCCCCC" w:sz="1"/>
+              <w:left w:val="single" w:color="CCCCCC" w:sz="1"/>
+              <w:bottom w:val="single" w:color="CCCCCC" w:sz="1"/>
+              <w:right w:val="single" w:color="CCCCCC" w:sz="1"/>
+            </w:tcBorders>
+            <w:tcMar>
+              <w:top w:type="dxa" w:w="80"/>
+              <w:left w:type="dxa" w:w="120"/>
+              <w:bottom w:type="dxa" w:w="80"/>
+              <w:right w:type="dxa" w:w="120"/>
+            </w:tcMar>
+          </w:tcPr>
+          <w:p>
+            <w:r>
+              <w:rPr>
+                <w:b w:val="false"/>
+                <w:bCs w:val="false"/>
+                <w:sz w:val="20"/>
+                <w:szCs w:val="20"/>
+              </w:rPr>
+              <w:t xml:space="preserve">WORD</w:t>
+            </w:r>
+          </w:p>
+        </w:tc>
+        <w:tc>
+          <w:tcPr>
+            <w:tcW w:type="dxa" w:w="3120"/>
+            <w:tcBorders>
+              <w:top w:val="single" w:color="CCCCCC" w:sz="1"/>
+              <w:left w:val="single" w:color="CCCCCC" w:sz="1"/>
+              <w:bottom w:val="single" w:color="CCCCCC" w:sz="1"/>
+              <w:right w:val="single" w:color="CCCCCC" w:sz="1"/>
+            </w:tcBorders>
+            <w:tcMar>
+              <w:top w:type="dxa" w:w="80"/>
+              <w:left w:type="dxa" w:w="120"/>
+              <w:bottom w:type="dxa" w:w="80"/>
+              <w:right w:type="dxa" w:w="120"/>
+            </w:tcMar>
+          </w:tcPr>
+          <w:p>
+            <w:r>
+              <w:rPr>
+                <w:b w:val="false"/>
+                <w:bCs w:val="false"/>
+                <w:sz w:val="20"/>
+                <w:szCs w:val="20"/>
+              </w:rPr>
+              <w:t xml:space="preserve">Mot ordinaire</w:t>
+            </w:r>
+          </w:p>
+        </w:tc>
+        <w:tc>
+          <w:tcPr>
+            <w:tcW w:type="dxa" w:w="3120"/>
+            <w:tcBorders>
+              <w:top w:val="single" w:color="CCCCCC" w:sz="1"/>
+              <w:left w:val="single" w:color="CCCCCC" w:sz="1"/>
+              <w:bottom w:val="single" w:color="CCCCCC" w:sz="1"/>
+              <w:right w:val="single" w:color="CCCCCC" w:sz="1"/>
+            </w:tcBorders>
+            <w:tcMar>
+              <w:top w:type="dxa" w:w="80"/>
+              <w:left w:type="dxa" w:w="120"/>
+              <w:bottom w:type="dxa" w:w="80"/>
+              <w:right w:type="dxa" w:w="120"/>
+            </w:tcMar>
+          </w:tcPr>
+          <w:p>
+            <w:r>
+              <w:rPr>
+                <w:b w:val="false"/>
+                <w:bCs w:val="false"/>
+                <w:sz w:val="20"/>
+                <w:szCs w:val="20"/>
+              </w:rPr>
+              <w:t xml:space="preserve">conservé</w:t>
+            </w:r>
+          </w:p>
+        </w:tc>
+      </w:tr>
+      <w:tr>
+        <w:tc>
+          <w:tcPr>
+            <w:tcW w:type="dxa" w:w="3120"/>
+            <w:tcBorders>
+              <w:top w:val="single" w:color="CCCCCC" w:sz="1"/>
+              <w:left w:val="single" w:color="CCCCCC" w:sz="1"/>
+              <w:bottom w:val="single" w:color="CCCCCC" w:sz="1"/>
+              <w:right w:val="single" w:color="CCCCCC" w:sz="1"/>
+            </w:tcBorders>
+            <w:tcMar>
+              <w:top w:type="dxa" w:w="80"/>
+              <w:left w:type="dxa" w:w="120"/>
+              <w:bottom w:type="dxa" w:w="80"/>
+              <w:right w:type="dxa" w:w="120"/>
+            </w:tcMar>
+          </w:tcPr>
+          <w:p>
+            <w:r>
+              <w:rPr>
+                <w:b w:val="false"/>
+                <w:bCs w:val="false"/>
+                <w:sz w:val="20"/>
+                <w:szCs w:val="20"/>
+              </w:rPr>
+              <w:t xml:space="preserve">NUMBER</w:t>
+            </w:r>
+          </w:p>
+        </w:tc>
+        <w:tc>
+          <w:tcPr>
+            <w:tcW w:type="dxa" w:w="3120"/>
+            <w:tcBorders>
+              <w:top w:val="single" w:color="CCCCCC" w:sz="1"/>
+              <w:left w:val="single" w:color="CCCCCC" w:sz="1"/>
+              <w:bottom w:val="single" w:color="CCCCCC" w:sz="1"/>
+              <w:right w:val="single" w:color="CCCCCC" w:sz="1"/>
+            </w:tcBorders>
+            <w:tcMar>
+              <w:top w:type="dxa" w:w="80"/>
+              <w:left w:type="dxa" w:w="120"/>
+              <w:bottom w:type="dxa" w:w="80"/>
+              <w:right w:type="dxa" w:w="120"/>
+            </w:tcMar>
+          </w:tcPr>
+          <w:p>
+            <w:r>
+              <w:rPr>
+                <w:b w:val="false"/>
+                <w:bCs w:val="false"/>
+                <w:sz w:val="20"/>
+                <w:szCs w:val="20"/>
+              </w:rPr>
+              <w:t xml:space="preserve">Entier isolé (non date/tél./montant)</w:t>
+            </w:r>
+          </w:p>
+        </w:tc>
+        <w:tc>
+          <w:tcPr>
+            <w:tcW w:type="dxa" w:w="3120"/>
+            <w:tcBorders>
+              <w:top w:val="single" w:color="CCCCCC" w:sz="1"/>
+              <w:left w:val="single" w:color="CCCCCC" w:sz="1"/>
+              <w:bottom w:val="single" w:color="CCCCCC" w:sz="1"/>
+              <w:right w:val="single" w:color="CCCCCC" w:sz="1"/>
+            </w:tcBorders>
+            <w:tcMar>
+              <w:top w:type="dxa" w:w="80"/>
+              <w:left w:type="dxa" w:w="120"/>
+              <w:bottom w:type="dxa" w:w="80"/>
+              <w:right w:type="dxa" w:w="120"/>
+            </w:tcMar>
+          </w:tcPr>
+          <w:p>
+            <w:r>
+              <w:rPr>
+                <w:b w:val="false"/>
+                <w:bCs w:val="false"/>
+                <w:sz w:val="20"/>
+                <w:szCs w:val="20"/>
+              </w:rPr>
+              <w:t xml:space="preserve">conservé</w:t>
+            </w:r>
+          </w:p>
+        </w:tc>
+      </w:tr>
+      <w:tr>
+        <w:tc>
+          <w:tcPr>
+            <w:tcW w:type="dxa" w:w="3120"/>
+            <w:tcBorders>
+              <w:top w:val="single" w:color="CCCCCC" w:sz="1"/>
+              <w:left w:val="single" w:color="CCCCCC" w:sz="1"/>
+              <w:bottom w:val="single" w:color="CCCCCC" w:sz="1"/>
+              <w:right w:val="single" w:color="CCCCCC" w:sz="1"/>
+            </w:tcBorders>
+            <w:tcMar>
+              <w:top w:type="dxa" w:w="80"/>
+              <w:left w:type="dxa" w:w="120"/>
+              <w:bottom w:type="dxa" w:w="80"/>
+              <w:right w:type="dxa" w:w="120"/>
+            </w:tcMar>
+          </w:tcPr>
+          <w:p>
+            <w:r>
+              <w:rPr>
+                <w:b w:val="false"/>
+                <w:bCs w:val="false"/>
+                <w:sz w:val="20"/>
+                <w:szCs w:val="20"/>
+              </w:rPr>
+              <w:t xml:space="preserve">OTHER</w:t>
+            </w:r>
+          </w:p>
+        </w:tc>
+        <w:tc>
+          <w:tcPr>
+            <w:tcW w:type="dxa" w:w="3120"/>
+            <w:tcBorders>
+              <w:top w:val="single" w:color="CCCCCC" w:sz="1"/>
+              <w:left w:val="single" w:color="CCCCCC" w:sz="1"/>
+              <w:bottom w:val="single" w:color="CCCCCC" w:sz="1"/>
+              <w:right w:val="single" w:color="CCCCCC" w:sz="1"/>
+            </w:tcBorders>
+            <w:tcMar>
+              <w:top w:type="dxa" w:w="80"/>
+              <w:left w:type="dxa" w:w="120"/>
+              <w:bottom w:type="dxa" w:w="80"/>
+              <w:right w:type="dxa" w:w="120"/>
+            </w:tcMar>
+          </w:tcPr>
+          <w:p>
+            <w:r>
+              <w:rPr>
+                <w:b w:val="false"/>
+                <w:bCs w:val="false"/>
+                <w:sz w:val="20"/>
+                <w:szCs w:val="20"/>
+              </w:rPr>
+              <w:t xml:space="preserve">Espace, ponctuation, saut de ligne</w:t>
+            </w:r>
+          </w:p>
+        </w:tc>
+        <w:tc>
+          <w:tcPr>
+            <w:tcW w:type="dxa" w:w="3120"/>
+            <w:tcBorders>
+              <w:top w:val="single" w:color="CCCCCC" w:sz="1"/>
+              <w:left w:val="single" w:color="CCCCCC" w:sz="1"/>
+              <w:bottom w:val="single" w:color="CCCCCC" w:sz="1"/>
+              <w:right w:val="single" w:color="CCCCCC" w:sz="1"/>
+            </w:tcBorders>
+            <w:tcMar>
+              <w:top w:type="dxa" w:w="80"/>
+              <w:left w:type="dxa" w:w="120"/>
+              <w:bottom w:type="dxa" w:w="80"/>
+              <w:right w:type="dxa" w:w="120"/>
+            </w:tcMar>
+          </w:tcPr>
+          <w:p>
+            <w:r>
+              <w:rPr>
+                <w:b w:val="false"/>
+                <w:bCs w:val="false"/>
+                <w:sz w:val="20"/>
+                <w:szCs w:val="20"/>
+              </w:rPr>
+              <w:t xml:space="preserve">conservé</w:t>
+            </w:r>
+          </w:p>
+        </w:tc>
+      </w:tr>
+    </w:tbl>
+    <w:p>
+      <w:pPr>
+        <w:spacing w:after="160"/>
+      </w:pPr>
+      <w:r>
+        <w:t xml:space="preserve">Choix de conception : le texte devant être restitué à l'identique, aucun caractère n'est ignoré (pas de règle SKIP). Les espaces, la ponctuation et les retours à la ligne sont capturés par le token OTHER (règle catch-all ~[]) et réémis tels quels : le lexer couvre donc la totalité du flux d'entrée.</w:t>
+      </w:r>
+    </w:p>
+    <w:p>
+      <w:pPr>
+        <w:pStyle w:val="Heading2"/>
+      </w:pPr>
+      <w:r>
+        <w:t xml:space="preserve">4.2 Tokens auxiliaires (privés)</w:t>
+      </w:r>
+    </w:p>
+    <w:p>
+      <w:pPr>
+        <w:shd w:fill="F2F2F2" w:val="clear"/>
+        <w:spacing w:after="0"/>
+      </w:pPr>
+      <w:r>
+        <w:rPr>
+          <w:rFonts w:ascii="Consolas" w:cs="Consolas" w:eastAsia="Consolas" w:hAnsi="Consolas"/>
+          <w:sz w:val="18"/>
+          <w:szCs w:val="18"/>
+        </w:rPr>
+        <w:t xml:space="preserve">&lt; #DIGIT : ["0"-"9"] &gt;</w:t>
+      </w:r>
+    </w:p>
+    <w:p>
+      <w:pPr>
+        <w:shd w:fill="F2F2F2" w:val="clear"/>
+        <w:spacing w:after="0"/>
+      </w:pPr>
+      <w:r>
+        <w:rPr>
+          <w:rFonts w:ascii="Consolas" w:cs="Consolas" w:eastAsia="Consolas" w:hAnsi="Consolas"/>
+          <w:sz w:val="18"/>
+          <w:szCs w:val="18"/>
+        </w:rPr>
+        <w:t xml:space="preserve">&lt; #MAJ   : [ "A"-"Z", "À","Á","Â","Ã","Ä","Ç","È","É","Ê","Ë", … ] &gt;   // majuscules accentuées</w:t>
+      </w:r>
+    </w:p>
+    <w:p>
+      <w:pPr>
+        <w:shd w:fill="F2F2F2" w:val="clear"/>
+        <w:spacing w:after="0"/>
+      </w:pPr>
+      <w:r>
+        <w:rPr>
+          <w:rFonts w:ascii="Consolas" w:cs="Consolas" w:eastAsia="Consolas" w:hAnsi="Consolas"/>
+          <w:sz w:val="18"/>
+          <w:szCs w:val="18"/>
+        </w:rPr>
+        <w:t xml:space="preserve">&lt; #MIN   : [ "a"-"z", "à","á","â","ã","ä","ç","è","é","ê","ë", … ] &gt;   // minuscules accentuées</w:t>
+      </w:r>
+    </w:p>
+    <w:p>
+      <w:pPr>
+        <w:shd w:fill="F2F2F2" w:val="clear"/>
+        <w:spacing w:after="0"/>
+      </w:pPr>
+      <w:r>
+        <w:rPr>
+          <w:rFonts w:ascii="Consolas" w:cs="Consolas" w:eastAsia="Consolas" w:hAnsi="Consolas"/>
+          <w:sz w:val="18"/>
+          <w:szCs w:val="18"/>
+        </w:rPr>
+        <w:t xml:space="preserve">&lt; #LET   : &lt;MAJ&gt; | &lt;MIN&gt; &gt;</w:t>
+      </w:r>
+    </w:p>
+    <w:p>
+      <w:pPr>
+        <w:shd w:fill="F2F2F2" w:val="clear"/>
+        <w:spacing w:after="200"/>
+      </w:pPr>
+      <w:r>
+        <w:rPr>
+          <w:rFonts w:ascii="Consolas" w:cs="Consolas" w:eastAsia="Consolas" w:hAnsi="Consolas"/>
+          <w:sz w:val="18"/>
+          <w:szCs w:val="18"/>
+        </w:rPr>
+        <w:t xml:space="preserve">&lt; #MONTH : "janvier" | "février" | … | "décembre" &gt;</w:t>
+      </w:r>
+    </w:p>
+    <w:p>
+      <w:pPr>
+        <w:spacing w:after="160"/>
+      </w:pPr>
+      <w:r>
+        <w:t xml:space="preserve">Les classes MAJ/MIN incluent les lettres accentuées françaises (é, è, à, ç, ï, û…), ce qui traite la difficulté « accents » identifiée en Partie 1.3.</w:t>
+      </w:r>
+    </w:p>
+    <w:p>
+      <w:pPr>
+        <w:pStyle w:val="Heading2"/>
+      </w:pPr>
+      <w:r>
+        <w:t xml:space="preserve">4.3 Règles lexicales (extraits commentés)</w:t>
+      </w:r>
+    </w:p>
+    <w:p>
+      <w:pPr>
+        <w:spacing w:after="160"/>
+      </w:pPr>
+      <w:r>
+        <w:rPr>
+          <w:b w:val="false"/>
+          <w:bCs w:val="false"/>
+        </w:rPr>
+        <w:t xml:space="preserve">EMAIL — partie locale (lettres/chiffres/points/tirets/apostrophe) + « @ » + domaine avec au moins un point (couvre gmail.com comme mail.co.uk) :</w:t>
+      </w:r>
+    </w:p>
+    <w:p>
+      <w:pPr>
+        <w:shd w:fill="F2F2F2" w:val="clear"/>
+        <w:spacing w:after="0"/>
+      </w:pPr>
+      <w:r>
+        <w:rPr>
+          <w:rFonts w:ascii="Consolas" w:cs="Consolas" w:eastAsia="Consolas" w:hAnsi="Consolas"/>
+          <w:sz w:val="18"/>
+          <w:szCs w:val="18"/>
+        </w:rPr>
+        <w:t xml:space="preserve">&lt; EMAIL :</w:t>
+      </w:r>
+    </w:p>
+    <w:p>
+      <w:pPr>
+        <w:shd w:fill="F2F2F2" w:val="clear"/>
+        <w:spacing w:after="0"/>
+      </w:pPr>
+      <w:r>
+        <w:rPr>
+          <w:rFonts w:ascii="Consolas" w:cs="Consolas" w:eastAsia="Consolas" w:hAnsi="Consolas"/>
+          <w:sz w:val="18"/>
+          <w:szCs w:val="18"/>
+        </w:rPr>
+        <w:t xml:space="preserve">    ( &lt;LET&gt; | &lt;DIGIT&gt; | "." | "_" | "%" | "+" | "-" | "'" )+</w:t>
+      </w:r>
+    </w:p>
+    <w:p>
+      <w:pPr>
+        <w:shd w:fill="F2F2F2" w:val="clear"/>
+        <w:spacing w:after="0"/>
+      </w:pPr>
+      <w:r>
+        <w:rPr>
+          <w:rFonts w:ascii="Consolas" w:cs="Consolas" w:eastAsia="Consolas" w:hAnsi="Consolas"/>
+          <w:sz w:val="18"/>
+          <w:szCs w:val="18"/>
+        </w:rPr>
+        <w:t xml:space="preserve">    "@"</w:t>
+      </w:r>
+    </w:p>
+    <w:p>
+      <w:pPr>
+        <w:shd w:fill="F2F2F2" w:val="clear"/>
+        <w:spacing w:after="0"/>
+      </w:pPr>
+      <w:r>
+        <w:rPr>
+          <w:rFonts w:ascii="Consolas" w:cs="Consolas" w:eastAsia="Consolas" w:hAnsi="Consolas"/>
+          <w:sz w:val="18"/>
+          <w:szCs w:val="18"/>
+        </w:rPr>
+        <w:t xml:space="preserve">    ( &lt;LET&gt; | &lt;DIGIT&gt; | "-" )+ ( "." ( &lt;LET&gt; | &lt;DIGIT&gt; | "-" )+ )+</w:t>
+      </w:r>
+    </w:p>
+    <w:p>
+      <w:pPr>
+        <w:shd w:fill="F2F2F2" w:val="clear"/>
+        <w:spacing w:after="200"/>
+      </w:pPr>
+      <w:r>
+        <w:rPr>
+          <w:rFonts w:ascii="Consolas" w:cs="Consolas" w:eastAsia="Consolas" w:hAnsi="Consolas"/>
+          <w:sz w:val="18"/>
+          <w:szCs w:val="18"/>
+        </w:rPr>
+        <w:t xml:space="preserve">&gt;</w:t>
+      </w:r>
+    </w:p>
+    <w:p>
+      <w:pPr>
+        <w:spacing w:after="160"/>
+      </w:pPr>
+      <w:r>
+        <w:t xml:space="preserve">PHONE — indicatif +221 optionnel puis groupes 2-3-2-2 (espace ou tiret), ou 9 chiffres accolés :</w:t>
+      </w:r>
+    </w:p>
+    <w:p>
+      <w:pPr>
+        <w:shd w:fill="F2F2F2" w:val="clear"/>
+        <w:spacing w:after="0"/>
+      </w:pPr>
+      <w:r>
+        <w:rPr>
+          <w:rFonts w:ascii="Consolas" w:cs="Consolas" w:eastAsia="Consolas" w:hAnsi="Consolas"/>
+          <w:sz w:val="18"/>
+          <w:szCs w:val="18"/>
+        </w:rPr>
+        <w:t xml:space="preserve">&lt; PHONE :</w:t>
+      </w:r>
+    </w:p>
+    <w:p>
+      <w:pPr>
+        <w:shd w:fill="F2F2F2" w:val="clear"/>
+        <w:spacing w:after="0"/>
+      </w:pPr>
+      <w:r>
+        <w:rPr>
+          <w:rFonts w:ascii="Consolas" w:cs="Consolas" w:eastAsia="Consolas" w:hAnsi="Consolas"/>
+          <w:sz w:val="18"/>
+          <w:szCs w:val="18"/>
+        </w:rPr>
+        <w:t xml:space="preserve">    ( "+" &lt;DIGIT&gt; &lt;DIGIT&gt; &lt;DIGIT&gt; ( " " )? )?</w:t>
+      </w:r>
+    </w:p>
+    <w:p>
+      <w:pPr>
+        <w:shd w:fill="F2F2F2" w:val="clear"/>
+        <w:spacing w:after="0"/>
+      </w:pPr>
+      <w:r>
+        <w:rPr>
+          <w:rFonts w:ascii="Consolas" w:cs="Consolas" w:eastAsia="Consolas" w:hAnsi="Consolas"/>
+          <w:sz w:val="18"/>
+          <w:szCs w:val="18"/>
+        </w:rPr>
+        <w:t xml:space="preserve">    &lt;DIGIT&gt; &lt;DIGIT&gt; (" "|"-") &lt;DIGIT&gt; &lt;DIGIT&gt; &lt;DIGIT&gt; (" "|"-") &lt;DIGIT&gt; &lt;DIGIT&gt; (" "|"-") &lt;DIGIT&gt; &lt;DIGIT&gt;</w:t>
+      </w:r>
+    </w:p>
+    <w:p>
+      <w:pPr>
+        <w:shd w:fill="F2F2F2" w:val="clear"/>
+        <w:spacing w:after="0"/>
+      </w:pPr>
+      <w:r>
+        <w:rPr>
+          <w:rFonts w:ascii="Consolas" w:cs="Consolas" w:eastAsia="Consolas" w:hAnsi="Consolas"/>
+          <w:sz w:val="18"/>
+          <w:szCs w:val="18"/>
+        </w:rPr>
+        <w:t xml:space="preserve">  | &lt;DIGIT&gt; &lt;DIGIT&gt; &lt;DIGIT&gt; &lt;DIGIT&gt; &lt;DIGIT&gt; &lt;DIGIT&gt; &lt;DIGIT&gt; &lt;DIGIT&gt; &lt;DIGIT&gt;</w:t>
+      </w:r>
+    </w:p>
+    <w:p>
+      <w:pPr>
+        <w:shd w:fill="F2F2F2" w:val="clear"/>
+        <w:spacing w:after="200"/>
+      </w:pPr>
+      <w:r>
+        <w:rPr>
+          <w:rFonts w:ascii="Consolas" w:cs="Consolas" w:eastAsia="Consolas" w:hAnsi="Consolas"/>
+          <w:sz w:val="18"/>
+          <w:szCs w:val="18"/>
+        </w:rPr>
+        <w:t xml:space="preserve">&gt;</w:t>
+      </w:r>
+    </w:p>
+    <w:p>
+      <w:pPr>
+        <w:spacing w:after="160"/>
+      </w:pPr>
+      <w:r>
+        <w:t xml:space="preserve">DATE — JJ/MM/AAAA, JJ-MM-AAAA, AAAA/MM/JJ, ou date en toutes lettres (« 5 juin 2026 ») ; AMOUNT — nombre avec séparateurs de milliers suivi d'une devise obligatoire (FCFA/CFA), ce qui lève l'ambiguïté avec un simple nombre ou un téléphone :</w:t>
+      </w:r>
+    </w:p>
+    <w:p>
+      <w:pPr>
+        <w:shd w:fill="F2F2F2" w:val="clear"/>
+        <w:spacing w:after="0"/>
+      </w:pPr>
+      <w:r>
+        <w:rPr>
+          <w:rFonts w:ascii="Consolas" w:cs="Consolas" w:eastAsia="Consolas" w:hAnsi="Consolas"/>
+          <w:sz w:val="18"/>
+          <w:szCs w:val="18"/>
+        </w:rPr>
+        <w:t xml:space="preserve">&lt; AMOUNT :</w:t>
+      </w:r>
+    </w:p>
+    <w:p>
+      <w:pPr>
+        <w:shd w:fill="F2F2F2" w:val="clear"/>
+        <w:spacing w:after="0"/>
+      </w:pPr>
+      <w:r>
+        <w:rPr>
+          <w:rFonts w:ascii="Consolas" w:cs="Consolas" w:eastAsia="Consolas" w:hAnsi="Consolas"/>
+          <w:sz w:val="18"/>
+          <w:szCs w:val="18"/>
+        </w:rPr>
+        <w:t xml:space="preserve">    &lt;DIGIT&gt; (&lt;DIGIT&gt;)* ( ( " " | "." ) &lt;DIGIT&gt;&lt;DIGIT&gt;&lt;DIGIT&gt; )*</w:t>
+      </w:r>
+    </w:p>
+    <w:p>
+      <w:pPr>
+        <w:shd w:fill="F2F2F2" w:val="clear"/>
+        <w:spacing w:after="0"/>
+      </w:pPr>
+      <w:r>
+        <w:rPr>
+          <w:rFonts w:ascii="Consolas" w:cs="Consolas" w:eastAsia="Consolas" w:hAnsi="Consolas"/>
+          <w:sz w:val="18"/>
+          <w:szCs w:val="18"/>
+        </w:rPr>
+        <w:t xml:space="preserve">    ( " " )? ( "FCFA" | "F" ( " " )? "CFA" | "CFA" )</w:t>
+      </w:r>
+    </w:p>
+    <w:p>
+      <w:pPr>
+        <w:shd w:fill="F2F2F2" w:val="clear"/>
+        <w:spacing w:after="200"/>
+      </w:pPr>
+      <w:r>
+        <w:rPr>
+          <w:rFonts w:ascii="Consolas" w:cs="Consolas" w:eastAsia="Consolas" w:hAnsi="Consolas"/>
+          <w:sz w:val="18"/>
+          <w:szCs w:val="18"/>
+        </w:rPr>
+        <w:t xml:space="preserve">&gt;</w:t>
+      </w:r>
+    </w:p>
+    <w:p>
+      <w:pPr>
+        <w:spacing w:after="160"/>
+      </w:pPr>
+      <w:r>
+        <w:t xml:space="preserve">TITLE, PERSON, WORD, NUMBER, OTHER :</w:t>
+      </w:r>
+    </w:p>
+    <w:p>
+      <w:pPr>
+        <w:shd w:fill="F2F2F2" w:val="clear"/>
+        <w:spacing w:after="0"/>
+      </w:pPr>
+      <w:r>
+        <w:rPr>
+          <w:rFonts w:ascii="Consolas" w:cs="Consolas" w:eastAsia="Consolas" w:hAnsi="Consolas"/>
+          <w:sz w:val="18"/>
+          <w:szCs w:val="18"/>
+        </w:rPr>
+        <w:t xml:space="preserve">&lt; TITLE  : "Monsieur" | "Madame" | "Mademoiselle" | "Mlle" | "Mme" | "M." | "Dr" | "Docteur" | … &gt;</w:t>
+      </w:r>
+    </w:p>
+    <w:p>
+      <w:pPr>
+        <w:shd w:fill="F2F2F2" w:val="clear"/>
+        <w:spacing w:after="0"/>
+      </w:pPr>
+      <w:r>
+        <w:rPr>
+          <w:rFonts w:ascii="Consolas" w:cs="Consolas" w:eastAsia="Consolas" w:hAnsi="Consolas"/>
+          <w:sz w:val="18"/>
+          <w:szCs w:val="18"/>
+        </w:rPr>
+        <w:t xml:space="preserve">&lt; PERSON : &lt;MAJ&gt; ( &lt;MIN&gt; )+ &gt;</w:t>
+      </w:r>
+    </w:p>
+    <w:p>
+      <w:pPr>
+        <w:shd w:fill="F2F2F2" w:val="clear"/>
+        <w:spacing w:after="0"/>
+      </w:pPr>
+      <w:r>
+        <w:rPr>
+          <w:rFonts w:ascii="Consolas" w:cs="Consolas" w:eastAsia="Consolas" w:hAnsi="Consolas"/>
+          <w:sz w:val="18"/>
+          <w:szCs w:val="18"/>
+        </w:rPr>
+        <w:t xml:space="preserve">&lt; WORD   : &lt;LET&gt; ( &lt;LET&gt; | "'" | "-" )* &gt;</w:t>
+      </w:r>
+    </w:p>
+    <w:p>
+      <w:pPr>
+        <w:shd w:fill="F2F2F2" w:val="clear"/>
+        <w:spacing w:after="0"/>
+      </w:pPr>
+      <w:r>
+        <w:rPr>
+          <w:rFonts w:ascii="Consolas" w:cs="Consolas" w:eastAsia="Consolas" w:hAnsi="Consolas"/>
+          <w:sz w:val="18"/>
+          <w:szCs w:val="18"/>
+        </w:rPr>
+        <w:t xml:space="preserve">&lt; NUMBER : ( &lt;DIGIT&gt; )+ &gt;</w:t>
+      </w:r>
+    </w:p>
+    <w:p>
+      <w:pPr>
+        <w:shd w:fill="F2F2F2" w:val="clear"/>
+        <w:spacing w:after="200"/>
+      </w:pPr>
+      <w:r>
+        <w:rPr>
+          <w:rFonts w:ascii="Consolas" w:cs="Consolas" w:eastAsia="Consolas" w:hAnsi="Consolas"/>
+          <w:sz w:val="18"/>
+          <w:szCs w:val="18"/>
+        </w:rPr>
+        <w:t xml:space="preserve">&lt; OTHER  : ~[] &gt;</w:t>
+      </w:r>
+    </w:p>
+    <w:p>
+      <w:pPr>
+        <w:pStyle w:val="Heading2"/>
+      </w:pPr>
+      <w:r>
+        <w:t xml:space="preserve">4.4 Résultat d'instrumentation (test1)</w:t>
+      </w:r>
+    </w:p>
+    <w:p>
+      <w:pPr>
+        <w:spacing w:after="160"/>
+      </w:pPr>
+      <w:r>
+        <w:t xml:space="preserve">Extrait de la sortie réelle du lexer sur test1_exemple_sujet.txt (voir Partie 8 pour le détail complet) :</w:t>
+      </w:r>
+    </w:p>
+    <w:p>
+      <w:pPr>
+        <w:shd w:fill="F2F2F2" w:val="clear"/>
+        <w:spacing w:after="0"/>
+      </w:pPr>
+      <w:r>
+        <w:rPr>
+          <w:rFonts w:ascii="Consolas" w:cs="Consolas" w:eastAsia="Consolas" w:hAnsi="Consolas"/>
+          <w:sz w:val="18"/>
+          <w:szCs w:val="18"/>
+        </w:rPr>
+        <w:t xml:space="preserve">[TITRE : "Monsieur"]   [PERSONNE : "Amadou"]   [PERSONNE : "Diallo"]</w:t>
+      </w:r>
+    </w:p>
+    <w:p>
+      <w:pPr>
+        <w:shd w:fill="F2F2F2" w:val="clear"/>
+        <w:spacing w:after="0"/>
+      </w:pPr>
+      <w:r>
+        <w:rPr>
+          <w:rFonts w:ascii="Consolas" w:cs="Consolas" w:eastAsia="Consolas" w:hAnsi="Consolas"/>
+          <w:sz w:val="18"/>
+          <w:szCs w:val="18"/>
+        </w:rPr>
+        <w:t xml:space="preserve">[MOT : "est"] … [TELEPHONE : "77 123 45 67"] [AUTRE : "."]</w:t>
+      </w:r>
+    </w:p>
+    <w:p>
+      <w:pPr>
+        <w:shd w:fill="F2F2F2" w:val="clear"/>
+        <w:spacing w:after="0"/>
+      </w:pPr>
+      <w:r>
+        <w:rPr>
+          <w:rFonts w:ascii="Consolas" w:cs="Consolas" w:eastAsia="Consolas" w:hAnsi="Consolas"/>
+          <w:sz w:val="18"/>
+          <w:szCs w:val="18"/>
+        </w:rPr>
+        <w:t xml:space="preserve">[PERSONNE : "Son"] … [EMAIL : "amadou.diallo@gmail.com"] [AUTRE : "."]</w:t>
+      </w:r>
+    </w:p>
+    <w:p>
+      <w:pPr>
+        <w:shd w:fill="F2F2F2" w:val="clear"/>
+        <w:spacing w:after="200"/>
+      </w:pPr>
+      <w:r>
+        <w:rPr>
+          <w:rFonts w:ascii="Consolas" w:cs="Consolas" w:eastAsia="Consolas" w:hAnsi="Consolas"/>
+          <w:sz w:val="18"/>
+          <w:szCs w:val="18"/>
+        </w:rPr>
+        <w:t xml:space="preserve">[PERSONNE : "Le"] … [MONTANT : "250000 FCFA"] … [DATE : "15/06/2026"]</w:t>
+      </w:r>
+    </w:p>
+    <w:p>
+      <w:pPr>
+        <w:spacing w:after="160"/>
+      </w:pPr>
+      <w:r>
+        <w:t xml:space="preserve">Les cinq catégories sensibles sont correctement isolées, ainsi que la civilité « Monsieur ».</w:t>
       </w:r>
     </w:p>
     <w:p>
@@ -723,46 +2106,15 @@
     </w:p>
     <w:p>
       <w:pPr>
-        <w:shd w:fill="FFF2CC" w:val="clear"/>
-        <w:spacing w:after="200"/>
+        <w:spacing w:after="160"/>
       </w:pPr>
       <w:r>
         <w:rPr>
           <w:i/>
           <w:iCs/>
-          <w:color w:val="7F6000"/>
-        </w:rPr>
-        <w:t xml:space="preserve">À COMPLÉTER — Membre 1 + Membre 2 — étudier plusieurs chaînes d'entrée, montrer le fonctionnement du Maximal Munch dans la spécification JavaCC, identifier et expliquer les conflits lexicaux rencontrés.</w:t>
-      </w:r>
-    </w:p>
-    <w:p>
-      <w:pPr>
-        <w:pStyle w:val="Heading1"/>
-      </w:pPr>
-      <w:r>
-        <w:t xml:space="preserve">Partie 6 — Analyse syntaxique</w:t>
-      </w:r>
-    </w:p>
-    <w:p>
-      <w:pPr>
-        <w:shd w:fill="FFF2CC" w:val="clear"/>
-        <w:spacing w:after="200"/>
-      </w:pPr>
-      <w:r>
-        <w:rPr>
-          <w:i/>
-          <w:iCs/>
-          <w:color w:val="7F6000"/>
-        </w:rPr>
-        <w:t xml:space="preserve">À COMPLÉTER — Membre 2 — définir la grammaire acceptant toute suite valide de tokens (règles de production, diagramme syntaxique le cas échéant).</w:t>
-      </w:r>
-    </w:p>
-    <w:p>
-      <w:pPr>
-        <w:pStyle w:val="Heading1"/>
-      </w:pPr>
-      <w:r>
-        <w:t xml:space="preserve">Partie 7 — Implémentation</w:t>
+          <w:color w:val="555555"/>
+        </w:rPr>
+        <w:t xml:space="preserve">Responsable : Membre 1 (théorie) + Membre 2 (mise en œuvre JavaCC, ci-dessous).</w:t>
       </w:r>
     </w:p>
     <w:p>
@@ -770,7 +2122,7 @@
         <w:pStyle w:val="Heading2"/>
       </w:pPr>
       <w:r>
-        <w:t xml:space="preserve">7.1 Architecture</w:t>
+        <w:t xml:space="preserve">5.1 Le principe</w:t>
       </w:r>
     </w:p>
     <w:p>
@@ -778,7 +2130,994 @@
         <w:spacing w:after="160"/>
       </w:pPr>
       <w:r>
-        <w:t xml:space="preserve">Le programme est organisé en trois classes Java, dans le paquetage anonymizer :</w:t>
+        <w:t xml:space="preserve">Le Maximal Munch (« plus longue correspondance ») est la règle qu'applique l'analyseur lexical généré par JavaCC : (1) à une position donnée, le lexer choisit le token qui consomme le plus grand nombre de caractères ; (2) en cas d'égalité de longueur entre deux règles, JavaCC retient celle déclarée en premier dans le fichier .jj.</w:t>
+      </w:r>
+    </w:p>
+    <w:p>
+      <w:pPr>
+        <w:spacing w:after="160"/>
+      </w:pPr>
+      <w:r>
+        <w:t xml:space="preserve">C'est pourquoi l'ordre des tokens dans Anonymizer.jj est significatif : EMAIL, PHONE, DATE, AMOUNT, TITLE, PERSON, WORD, NUMBER, OTHER.</w:t>
+      </w:r>
+    </w:p>
+    <w:p>
+      <w:pPr>
+        <w:pStyle w:val="Heading2"/>
+      </w:pPr>
+      <w:r>
+        <w:t xml:space="preserve">5.2 Conflits lexicaux et leur résolution</w:t>
+      </w:r>
+    </w:p>
+    <w:tbl>
+      <w:tblPr>
+        <w:tblW w:type="dxa" w:w="9360"/>
+        <w:tblBorders>
+          <w:top w:val="single" w:color="auto" w:sz="4"/>
+          <w:left w:val="single" w:color="auto" w:sz="4"/>
+          <w:bottom w:val="single" w:color="auto" w:sz="4"/>
+          <w:right w:val="single" w:color="auto" w:sz="4"/>
+          <w:insideH w:val="single" w:color="auto" w:sz="4"/>
+          <w:insideV w:val="single" w:color="auto" w:sz="4"/>
+        </w:tblBorders>
+      </w:tblPr>
+      <w:tblGrid>
+        <w:gridCol w:w="2400"/>
+        <w:gridCol w:w="3160"/>
+        <w:gridCol w:w="1600"/>
+        <w:gridCol w:w="2200"/>
+      </w:tblGrid>
+      <w:tr>
+        <w:tc>
+          <w:tcPr>
+            <w:tcW w:type="dxa" w:w="2400"/>
+            <w:tcBorders>
+              <w:top w:val="single" w:color="CCCCCC" w:sz="1"/>
+              <w:left w:val="single" w:color="CCCCCC" w:sz="1"/>
+              <w:bottom w:val="single" w:color="CCCCCC" w:sz="1"/>
+              <w:right w:val="single" w:color="CCCCCC" w:sz="1"/>
+            </w:tcBorders>
+            <w:shd w:fill="1F3864" w:val="clear"/>
+            <w:tcMar>
+              <w:top w:type="dxa" w:w="80"/>
+              <w:left w:type="dxa" w:w="120"/>
+              <w:bottom w:type="dxa" w:w="80"/>
+              <w:right w:type="dxa" w:w="120"/>
+            </w:tcMar>
+          </w:tcPr>
+          <w:p>
+            <w:r>
+              <w:rPr>
+                <w:b/>
+                <w:bCs/>
+                <w:color w:val="FFFFFF"/>
+                <w:sz w:val="20"/>
+                <w:szCs w:val="20"/>
+              </w:rPr>
+              <w:t xml:space="preserve">Chaîne</w:t>
+            </w:r>
+          </w:p>
+        </w:tc>
+        <w:tc>
+          <w:tcPr>
+            <w:tcW w:type="dxa" w:w="3160"/>
+            <w:tcBorders>
+              <w:top w:val="single" w:color="CCCCCC" w:sz="1"/>
+              <w:left w:val="single" w:color="CCCCCC" w:sz="1"/>
+              <w:bottom w:val="single" w:color="CCCCCC" w:sz="1"/>
+              <w:right w:val="single" w:color="CCCCCC" w:sz="1"/>
+            </w:tcBorders>
+            <w:shd w:fill="1F3864" w:val="clear"/>
+            <w:tcMar>
+              <w:top w:type="dxa" w:w="80"/>
+              <w:left w:type="dxa" w:w="120"/>
+              <w:bottom w:type="dxa" w:w="80"/>
+              <w:right w:type="dxa" w:w="120"/>
+            </w:tcMar>
+          </w:tcPr>
+          <w:p>
+            <w:r>
+              <w:rPr>
+                <w:b/>
+                <w:bCs/>
+                <w:color w:val="FFFFFF"/>
+                <w:sz w:val="20"/>
+                <w:szCs w:val="20"/>
+              </w:rPr>
+              <w:t xml:space="preserve">Règles en concurrence</w:t>
+            </w:r>
+          </w:p>
+        </w:tc>
+        <w:tc>
+          <w:tcPr>
+            <w:tcW w:type="dxa" w:w="1600"/>
+            <w:tcBorders>
+              <w:top w:val="single" w:color="CCCCCC" w:sz="1"/>
+              <w:left w:val="single" w:color="CCCCCC" w:sz="1"/>
+              <w:bottom w:val="single" w:color="CCCCCC" w:sz="1"/>
+              <w:right w:val="single" w:color="CCCCCC" w:sz="1"/>
+            </w:tcBorders>
+            <w:shd w:fill="1F3864" w:val="clear"/>
+            <w:tcMar>
+              <w:top w:type="dxa" w:w="80"/>
+              <w:left w:type="dxa" w:w="120"/>
+              <w:bottom w:type="dxa" w:w="80"/>
+              <w:right w:type="dxa" w:w="120"/>
+            </w:tcMar>
+          </w:tcPr>
+          <w:p>
+            <w:r>
+              <w:rPr>
+                <w:b/>
+                <w:bCs/>
+                <w:color w:val="FFFFFF"/>
+                <w:sz w:val="20"/>
+                <w:szCs w:val="20"/>
+              </w:rPr>
+              <w:t xml:space="preserve">Résolution</w:t>
+            </w:r>
+          </w:p>
+        </w:tc>
+        <w:tc>
+          <w:tcPr>
+            <w:tcW w:type="dxa" w:w="2200"/>
+            <w:tcBorders>
+              <w:top w:val="single" w:color="CCCCCC" w:sz="1"/>
+              <w:left w:val="single" w:color="CCCCCC" w:sz="1"/>
+              <w:bottom w:val="single" w:color="CCCCCC" w:sz="1"/>
+              <w:right w:val="single" w:color="CCCCCC" w:sz="1"/>
+            </w:tcBorders>
+            <w:shd w:fill="1F3864" w:val="clear"/>
+            <w:tcMar>
+              <w:top w:type="dxa" w:w="80"/>
+              <w:left w:type="dxa" w:w="120"/>
+              <w:bottom w:type="dxa" w:w="80"/>
+              <w:right w:type="dxa" w:w="120"/>
+            </w:tcMar>
+          </w:tcPr>
+          <w:p>
+            <w:r>
+              <w:rPr>
+                <w:b/>
+                <w:bCs/>
+                <w:color w:val="FFFFFF"/>
+                <w:sz w:val="20"/>
+                <w:szCs w:val="20"/>
+              </w:rPr>
+              <w:t xml:space="preserve">Mécanisme</w:t>
+            </w:r>
+          </w:p>
+        </w:tc>
+      </w:tr>
+      <w:tr>
+        <w:tc>
+          <w:tcPr>
+            <w:tcW w:type="dxa" w:w="2400"/>
+            <w:tcBorders>
+              <w:top w:val="single" w:color="CCCCCC" w:sz="1"/>
+              <w:left w:val="single" w:color="CCCCCC" w:sz="1"/>
+              <w:bottom w:val="single" w:color="CCCCCC" w:sz="1"/>
+              <w:right w:val="single" w:color="CCCCCC" w:sz="1"/>
+            </w:tcBorders>
+            <w:tcMar>
+              <w:top w:type="dxa" w:w="80"/>
+              <w:left w:type="dxa" w:w="120"/>
+              <w:bottom w:type="dxa" w:w="80"/>
+              <w:right w:type="dxa" w:w="120"/>
+            </w:tcMar>
+          </w:tcPr>
+          <w:p>
+            <w:r>
+              <w:rPr>
+                <w:b w:val="false"/>
+                <w:bCs w:val="false"/>
+                <w:sz w:val="20"/>
+                <w:szCs w:val="20"/>
+              </w:rPr>
+              <w:t xml:space="preserve">Amadou</w:t>
+            </w:r>
+          </w:p>
+        </w:tc>
+        <w:tc>
+          <w:tcPr>
+            <w:tcW w:type="dxa" w:w="3160"/>
+            <w:tcBorders>
+              <w:top w:val="single" w:color="CCCCCC" w:sz="1"/>
+              <w:left w:val="single" w:color="CCCCCC" w:sz="1"/>
+              <w:bottom w:val="single" w:color="CCCCCC" w:sz="1"/>
+              <w:right w:val="single" w:color="CCCCCC" w:sz="1"/>
+            </w:tcBorders>
+            <w:tcMar>
+              <w:top w:type="dxa" w:w="80"/>
+              <w:left w:type="dxa" w:w="120"/>
+              <w:bottom w:type="dxa" w:w="80"/>
+              <w:right w:type="dxa" w:w="120"/>
+            </w:tcMar>
+          </w:tcPr>
+          <w:p>
+            <w:r>
+              <w:rPr>
+                <w:b w:val="false"/>
+                <w:bCs w:val="false"/>
+                <w:sz w:val="20"/>
+                <w:szCs w:val="20"/>
+              </w:rPr>
+              <w:t xml:space="preserve">PERSON vs WORD</w:t>
+            </w:r>
+          </w:p>
+        </w:tc>
+        <w:tc>
+          <w:tcPr>
+            <w:tcW w:type="dxa" w:w="1600"/>
+            <w:tcBorders>
+              <w:top w:val="single" w:color="CCCCCC" w:sz="1"/>
+              <w:left w:val="single" w:color="CCCCCC" w:sz="1"/>
+              <w:bottom w:val="single" w:color="CCCCCC" w:sz="1"/>
+              <w:right w:val="single" w:color="CCCCCC" w:sz="1"/>
+            </w:tcBorders>
+            <w:tcMar>
+              <w:top w:type="dxa" w:w="80"/>
+              <w:left w:type="dxa" w:w="120"/>
+              <w:bottom w:type="dxa" w:w="80"/>
+              <w:right w:type="dxa" w:w="120"/>
+            </w:tcMar>
+          </w:tcPr>
+          <w:p>
+            <w:r>
+              <w:rPr>
+                <w:b w:val="false"/>
+                <w:bCs w:val="false"/>
+                <w:sz w:val="20"/>
+                <w:szCs w:val="20"/>
+              </w:rPr>
+              <w:t xml:space="preserve">PERSON</w:t>
+            </w:r>
+          </w:p>
+        </w:tc>
+        <w:tc>
+          <w:tcPr>
+            <w:tcW w:type="dxa" w:w="2200"/>
+            <w:tcBorders>
+              <w:top w:val="single" w:color="CCCCCC" w:sz="1"/>
+              <w:left w:val="single" w:color="CCCCCC" w:sz="1"/>
+              <w:bottom w:val="single" w:color="CCCCCC" w:sz="1"/>
+              <w:right w:val="single" w:color="CCCCCC" w:sz="1"/>
+            </w:tcBorders>
+            <w:tcMar>
+              <w:top w:type="dxa" w:w="80"/>
+              <w:left w:type="dxa" w:w="120"/>
+              <w:bottom w:type="dxa" w:w="80"/>
+              <w:right w:type="dxa" w:w="120"/>
+            </w:tcMar>
+          </w:tcPr>
+          <w:p>
+            <w:r>
+              <w:rPr>
+                <w:b w:val="false"/>
+                <w:bCs w:val="false"/>
+                <w:sz w:val="20"/>
+                <w:szCs w:val="20"/>
+              </w:rPr>
+              <w:t xml:space="preserve">Ordre (égalité)</w:t>
+            </w:r>
+          </w:p>
+        </w:tc>
+      </w:tr>
+      <w:tr>
+        <w:tc>
+          <w:tcPr>
+            <w:tcW w:type="dxa" w:w="2400"/>
+            <w:tcBorders>
+              <w:top w:val="single" w:color="CCCCCC" w:sz="1"/>
+              <w:left w:val="single" w:color="CCCCCC" w:sz="1"/>
+              <w:bottom w:val="single" w:color="CCCCCC" w:sz="1"/>
+              <w:right w:val="single" w:color="CCCCCC" w:sz="1"/>
+            </w:tcBorders>
+            <w:tcMar>
+              <w:top w:type="dxa" w:w="80"/>
+              <w:left w:type="dxa" w:w="120"/>
+              <w:bottom w:type="dxa" w:w="80"/>
+              <w:right w:type="dxa" w:w="120"/>
+            </w:tcMar>
+          </w:tcPr>
+          <w:p>
+            <w:r>
+              <w:rPr>
+                <w:b w:val="false"/>
+                <w:bCs w:val="false"/>
+                <w:sz w:val="20"/>
+                <w:szCs w:val="20"/>
+              </w:rPr>
+              <w:t xml:space="preserve">Aujourd'hui</w:t>
+            </w:r>
+          </w:p>
+        </w:tc>
+        <w:tc>
+          <w:tcPr>
+            <w:tcW w:type="dxa" w:w="3160"/>
+            <w:tcBorders>
+              <w:top w:val="single" w:color="CCCCCC" w:sz="1"/>
+              <w:left w:val="single" w:color="CCCCCC" w:sz="1"/>
+              <w:bottom w:val="single" w:color="CCCCCC" w:sz="1"/>
+              <w:right w:val="single" w:color="CCCCCC" w:sz="1"/>
+            </w:tcBorders>
+            <w:tcMar>
+              <w:top w:type="dxa" w:w="80"/>
+              <w:left w:type="dxa" w:w="120"/>
+              <w:bottom w:type="dxa" w:w="80"/>
+              <w:right w:type="dxa" w:w="120"/>
+            </w:tcMar>
+          </w:tcPr>
+          <w:p>
+            <w:r>
+              <w:rPr>
+                <w:b w:val="false"/>
+                <w:bCs w:val="false"/>
+                <w:sz w:val="20"/>
+                <w:szCs w:val="20"/>
+              </w:rPr>
+              <w:t xml:space="preserve">PERSON vs WORD</w:t>
+            </w:r>
+          </w:p>
+        </w:tc>
+        <w:tc>
+          <w:tcPr>
+            <w:tcW w:type="dxa" w:w="1600"/>
+            <w:tcBorders>
+              <w:top w:val="single" w:color="CCCCCC" w:sz="1"/>
+              <w:left w:val="single" w:color="CCCCCC" w:sz="1"/>
+              <w:bottom w:val="single" w:color="CCCCCC" w:sz="1"/>
+              <w:right w:val="single" w:color="CCCCCC" w:sz="1"/>
+            </w:tcBorders>
+            <w:tcMar>
+              <w:top w:type="dxa" w:w="80"/>
+              <w:left w:type="dxa" w:w="120"/>
+              <w:bottom w:type="dxa" w:w="80"/>
+              <w:right w:type="dxa" w:w="120"/>
+            </w:tcMar>
+          </w:tcPr>
+          <w:p>
+            <w:r>
+              <w:rPr>
+                <w:b w:val="false"/>
+                <w:bCs w:val="false"/>
+                <w:sz w:val="20"/>
+                <w:szCs w:val="20"/>
+              </w:rPr>
+              <w:t xml:space="preserve">WORD</w:t>
+            </w:r>
+          </w:p>
+        </w:tc>
+        <w:tc>
+          <w:tcPr>
+            <w:tcW w:type="dxa" w:w="2200"/>
+            <w:tcBorders>
+              <w:top w:val="single" w:color="CCCCCC" w:sz="1"/>
+              <w:left w:val="single" w:color="CCCCCC" w:sz="1"/>
+              <w:bottom w:val="single" w:color="CCCCCC" w:sz="1"/>
+              <w:right w:val="single" w:color="CCCCCC" w:sz="1"/>
+            </w:tcBorders>
+            <w:tcMar>
+              <w:top w:type="dxa" w:w="80"/>
+              <w:left w:type="dxa" w:w="120"/>
+              <w:bottom w:type="dxa" w:w="80"/>
+              <w:right w:type="dxa" w:w="120"/>
+            </w:tcMar>
+          </w:tcPr>
+          <w:p>
+            <w:r>
+              <w:rPr>
+                <w:b w:val="false"/>
+                <w:bCs w:val="false"/>
+                <w:sz w:val="20"/>
+                <w:szCs w:val="20"/>
+              </w:rPr>
+              <w:t xml:space="preserve">Longueur</w:t>
+            </w:r>
+          </w:p>
+        </w:tc>
+      </w:tr>
+      <w:tr>
+        <w:tc>
+          <w:tcPr>
+            <w:tcW w:type="dxa" w:w="2400"/>
+            <w:tcBorders>
+              <w:top w:val="single" w:color="CCCCCC" w:sz="1"/>
+              <w:left w:val="single" w:color="CCCCCC" w:sz="1"/>
+              <w:bottom w:val="single" w:color="CCCCCC" w:sz="1"/>
+              <w:right w:val="single" w:color="CCCCCC" w:sz="1"/>
+            </w:tcBorders>
+            <w:tcMar>
+              <w:top w:type="dxa" w:w="80"/>
+              <w:left w:type="dxa" w:w="120"/>
+              <w:bottom w:type="dxa" w:w="80"/>
+              <w:right w:type="dxa" w:w="120"/>
+            </w:tcMar>
+          </w:tcPr>
+          <w:p>
+            <w:r>
+              <w:rPr>
+                <w:b w:val="false"/>
+                <w:bCs w:val="false"/>
+                <w:sz w:val="20"/>
+                <w:szCs w:val="20"/>
+              </w:rPr>
+              <w:t xml:space="preserve">250000 FCFA</w:t>
+            </w:r>
+          </w:p>
+        </w:tc>
+        <w:tc>
+          <w:tcPr>
+            <w:tcW w:type="dxa" w:w="3160"/>
+            <w:tcBorders>
+              <w:top w:val="single" w:color="CCCCCC" w:sz="1"/>
+              <w:left w:val="single" w:color="CCCCCC" w:sz="1"/>
+              <w:bottom w:val="single" w:color="CCCCCC" w:sz="1"/>
+              <w:right w:val="single" w:color="CCCCCC" w:sz="1"/>
+            </w:tcBorders>
+            <w:tcMar>
+              <w:top w:type="dxa" w:w="80"/>
+              <w:left w:type="dxa" w:w="120"/>
+              <w:bottom w:type="dxa" w:w="80"/>
+              <w:right w:type="dxa" w:w="120"/>
+            </w:tcMar>
+          </w:tcPr>
+          <w:p>
+            <w:r>
+              <w:rPr>
+                <w:b w:val="false"/>
+                <w:bCs w:val="false"/>
+                <w:sz w:val="20"/>
+                <w:szCs w:val="20"/>
+              </w:rPr>
+              <w:t xml:space="preserve">AMOUNT vs NUMBER</w:t>
+            </w:r>
+          </w:p>
+        </w:tc>
+        <w:tc>
+          <w:tcPr>
+            <w:tcW w:type="dxa" w:w="1600"/>
+            <w:tcBorders>
+              <w:top w:val="single" w:color="CCCCCC" w:sz="1"/>
+              <w:left w:val="single" w:color="CCCCCC" w:sz="1"/>
+              <w:bottom w:val="single" w:color="CCCCCC" w:sz="1"/>
+              <w:right w:val="single" w:color="CCCCCC" w:sz="1"/>
+            </w:tcBorders>
+            <w:tcMar>
+              <w:top w:type="dxa" w:w="80"/>
+              <w:left w:type="dxa" w:w="120"/>
+              <w:bottom w:type="dxa" w:w="80"/>
+              <w:right w:type="dxa" w:w="120"/>
+            </w:tcMar>
+          </w:tcPr>
+          <w:p>
+            <w:r>
+              <w:rPr>
+                <w:b w:val="false"/>
+                <w:bCs w:val="false"/>
+                <w:sz w:val="20"/>
+                <w:szCs w:val="20"/>
+              </w:rPr>
+              <w:t xml:space="preserve">AMOUNT</w:t>
+            </w:r>
+          </w:p>
+        </w:tc>
+        <w:tc>
+          <w:tcPr>
+            <w:tcW w:type="dxa" w:w="2200"/>
+            <w:tcBorders>
+              <w:top w:val="single" w:color="CCCCCC" w:sz="1"/>
+              <w:left w:val="single" w:color="CCCCCC" w:sz="1"/>
+              <w:bottom w:val="single" w:color="CCCCCC" w:sz="1"/>
+              <w:right w:val="single" w:color="CCCCCC" w:sz="1"/>
+            </w:tcBorders>
+            <w:tcMar>
+              <w:top w:type="dxa" w:w="80"/>
+              <w:left w:type="dxa" w:w="120"/>
+              <w:bottom w:type="dxa" w:w="80"/>
+              <w:right w:type="dxa" w:w="120"/>
+            </w:tcMar>
+          </w:tcPr>
+          <w:p>
+            <w:r>
+              <w:rPr>
+                <w:b w:val="false"/>
+                <w:bCs w:val="false"/>
+                <w:sz w:val="20"/>
+                <w:szCs w:val="20"/>
+              </w:rPr>
+              <w:t xml:space="preserve">Longueur (devise)</w:t>
+            </w:r>
+          </w:p>
+        </w:tc>
+      </w:tr>
+      <w:tr>
+        <w:tc>
+          <w:tcPr>
+            <w:tcW w:type="dxa" w:w="2400"/>
+            <w:tcBorders>
+              <w:top w:val="single" w:color="CCCCCC" w:sz="1"/>
+              <w:left w:val="single" w:color="CCCCCC" w:sz="1"/>
+              <w:bottom w:val="single" w:color="CCCCCC" w:sz="1"/>
+              <w:right w:val="single" w:color="CCCCCC" w:sz="1"/>
+            </w:tcBorders>
+            <w:tcMar>
+              <w:top w:type="dxa" w:w="80"/>
+              <w:left w:type="dxa" w:w="120"/>
+              <w:bottom w:type="dxa" w:w="80"/>
+              <w:right w:type="dxa" w:w="120"/>
+            </w:tcMar>
+          </w:tcPr>
+          <w:p>
+            <w:r>
+              <w:rPr>
+                <w:b w:val="false"/>
+                <w:bCs w:val="false"/>
+                <w:sz w:val="20"/>
+                <w:szCs w:val="20"/>
+              </w:rPr>
+              <w:t xml:space="preserve">77 123 45 67</w:t>
+            </w:r>
+          </w:p>
+        </w:tc>
+        <w:tc>
+          <w:tcPr>
+            <w:tcW w:type="dxa" w:w="3160"/>
+            <w:tcBorders>
+              <w:top w:val="single" w:color="CCCCCC" w:sz="1"/>
+              <w:left w:val="single" w:color="CCCCCC" w:sz="1"/>
+              <w:bottom w:val="single" w:color="CCCCCC" w:sz="1"/>
+              <w:right w:val="single" w:color="CCCCCC" w:sz="1"/>
+            </w:tcBorders>
+            <w:tcMar>
+              <w:top w:type="dxa" w:w="80"/>
+              <w:left w:type="dxa" w:w="120"/>
+              <w:bottom w:type="dxa" w:w="80"/>
+              <w:right w:type="dxa" w:w="120"/>
+            </w:tcMar>
+          </w:tcPr>
+          <w:p>
+            <w:r>
+              <w:rPr>
+                <w:b w:val="false"/>
+                <w:bCs w:val="false"/>
+                <w:sz w:val="20"/>
+                <w:szCs w:val="20"/>
+              </w:rPr>
+              <w:t xml:space="preserve">PHONE vs AMOUNT</w:t>
+            </w:r>
+          </w:p>
+        </w:tc>
+        <w:tc>
+          <w:tcPr>
+            <w:tcW w:type="dxa" w:w="1600"/>
+            <w:tcBorders>
+              <w:top w:val="single" w:color="CCCCCC" w:sz="1"/>
+              <w:left w:val="single" w:color="CCCCCC" w:sz="1"/>
+              <w:bottom w:val="single" w:color="CCCCCC" w:sz="1"/>
+              <w:right w:val="single" w:color="CCCCCC" w:sz="1"/>
+            </w:tcBorders>
+            <w:tcMar>
+              <w:top w:type="dxa" w:w="80"/>
+              <w:left w:type="dxa" w:w="120"/>
+              <w:bottom w:type="dxa" w:w="80"/>
+              <w:right w:type="dxa" w:w="120"/>
+            </w:tcMar>
+          </w:tcPr>
+          <w:p>
+            <w:r>
+              <w:rPr>
+                <w:b w:val="false"/>
+                <w:bCs w:val="false"/>
+                <w:sz w:val="20"/>
+                <w:szCs w:val="20"/>
+              </w:rPr>
+              <w:t xml:space="preserve">PHONE</w:t>
+            </w:r>
+          </w:p>
+        </w:tc>
+        <w:tc>
+          <w:tcPr>
+            <w:tcW w:type="dxa" w:w="2200"/>
+            <w:tcBorders>
+              <w:top w:val="single" w:color="CCCCCC" w:sz="1"/>
+              <w:left w:val="single" w:color="CCCCCC" w:sz="1"/>
+              <w:bottom w:val="single" w:color="CCCCCC" w:sz="1"/>
+              <w:right w:val="single" w:color="CCCCCC" w:sz="1"/>
+            </w:tcBorders>
+            <w:tcMar>
+              <w:top w:type="dxa" w:w="80"/>
+              <w:left w:type="dxa" w:w="120"/>
+              <w:bottom w:type="dxa" w:w="80"/>
+              <w:right w:type="dxa" w:w="120"/>
+            </w:tcMar>
+          </w:tcPr>
+          <w:p>
+            <w:r>
+              <w:rPr>
+                <w:b w:val="false"/>
+                <w:bCs w:val="false"/>
+                <w:sz w:val="20"/>
+                <w:szCs w:val="20"/>
+              </w:rPr>
+              <w:t xml:space="preserve">Motif + devise</w:t>
+            </w:r>
+          </w:p>
+        </w:tc>
+      </w:tr>
+      <w:tr>
+        <w:tc>
+          <w:tcPr>
+            <w:tcW w:type="dxa" w:w="2400"/>
+            <w:tcBorders>
+              <w:top w:val="single" w:color="CCCCCC" w:sz="1"/>
+              <w:left w:val="single" w:color="CCCCCC" w:sz="1"/>
+              <w:bottom w:val="single" w:color="CCCCCC" w:sz="1"/>
+              <w:right w:val="single" w:color="CCCCCC" w:sz="1"/>
+            </w:tcBorders>
+            <w:tcMar>
+              <w:top w:type="dxa" w:w="80"/>
+              <w:left w:type="dxa" w:w="120"/>
+              <w:bottom w:type="dxa" w:w="80"/>
+              <w:right w:type="dxa" w:w="120"/>
+            </w:tcMar>
+          </w:tcPr>
+          <w:p>
+            <w:r>
+              <w:rPr>
+                <w:b w:val="false"/>
+                <w:bCs w:val="false"/>
+                <w:sz w:val="20"/>
+                <w:szCs w:val="20"/>
+              </w:rPr>
+              <w:t xml:space="preserve">781234567</w:t>
+            </w:r>
+          </w:p>
+        </w:tc>
+        <w:tc>
+          <w:tcPr>
+            <w:tcW w:type="dxa" w:w="3160"/>
+            <w:tcBorders>
+              <w:top w:val="single" w:color="CCCCCC" w:sz="1"/>
+              <w:left w:val="single" w:color="CCCCCC" w:sz="1"/>
+              <w:bottom w:val="single" w:color="CCCCCC" w:sz="1"/>
+              <w:right w:val="single" w:color="CCCCCC" w:sz="1"/>
+            </w:tcBorders>
+            <w:tcMar>
+              <w:top w:type="dxa" w:w="80"/>
+              <w:left w:type="dxa" w:w="120"/>
+              <w:bottom w:type="dxa" w:w="80"/>
+              <w:right w:type="dxa" w:w="120"/>
+            </w:tcMar>
+          </w:tcPr>
+          <w:p>
+            <w:r>
+              <w:rPr>
+                <w:b w:val="false"/>
+                <w:bCs w:val="false"/>
+                <w:sz w:val="20"/>
+                <w:szCs w:val="20"/>
+              </w:rPr>
+              <w:t xml:space="preserve">PHONE vs NUMBER</w:t>
+            </w:r>
+          </w:p>
+        </w:tc>
+        <w:tc>
+          <w:tcPr>
+            <w:tcW w:type="dxa" w:w="1600"/>
+            <w:tcBorders>
+              <w:top w:val="single" w:color="CCCCCC" w:sz="1"/>
+              <w:left w:val="single" w:color="CCCCCC" w:sz="1"/>
+              <w:bottom w:val="single" w:color="CCCCCC" w:sz="1"/>
+              <w:right w:val="single" w:color="CCCCCC" w:sz="1"/>
+            </w:tcBorders>
+            <w:tcMar>
+              <w:top w:type="dxa" w:w="80"/>
+              <w:left w:type="dxa" w:w="120"/>
+              <w:bottom w:type="dxa" w:w="80"/>
+              <w:right w:type="dxa" w:w="120"/>
+            </w:tcMar>
+          </w:tcPr>
+          <w:p>
+            <w:r>
+              <w:rPr>
+                <w:b w:val="false"/>
+                <w:bCs w:val="false"/>
+                <w:sz w:val="20"/>
+                <w:szCs w:val="20"/>
+              </w:rPr>
+              <w:t xml:space="preserve">PHONE</w:t>
+            </w:r>
+          </w:p>
+        </w:tc>
+        <w:tc>
+          <w:tcPr>
+            <w:tcW w:type="dxa" w:w="2200"/>
+            <w:tcBorders>
+              <w:top w:val="single" w:color="CCCCCC" w:sz="1"/>
+              <w:left w:val="single" w:color="CCCCCC" w:sz="1"/>
+              <w:bottom w:val="single" w:color="CCCCCC" w:sz="1"/>
+              <w:right w:val="single" w:color="CCCCCC" w:sz="1"/>
+            </w:tcBorders>
+            <w:tcMar>
+              <w:top w:type="dxa" w:w="80"/>
+              <w:left w:type="dxa" w:w="120"/>
+              <w:bottom w:type="dxa" w:w="80"/>
+              <w:right w:type="dxa" w:w="120"/>
+            </w:tcMar>
+          </w:tcPr>
+          <w:p>
+            <w:r>
+              <w:rPr>
+                <w:b w:val="false"/>
+                <w:bCs w:val="false"/>
+                <w:sz w:val="20"/>
+                <w:szCs w:val="20"/>
+              </w:rPr>
+              <w:t xml:space="preserve">Ordre (égalité)</w:t>
+            </w:r>
+          </w:p>
+        </w:tc>
+      </w:tr>
+      <w:tr>
+        <w:tc>
+          <w:tcPr>
+            <w:tcW w:type="dxa" w:w="2400"/>
+            <w:tcBorders>
+              <w:top w:val="single" w:color="CCCCCC" w:sz="1"/>
+              <w:left w:val="single" w:color="CCCCCC" w:sz="1"/>
+              <w:bottom w:val="single" w:color="CCCCCC" w:sz="1"/>
+              <w:right w:val="single" w:color="CCCCCC" w:sz="1"/>
+            </w:tcBorders>
+            <w:tcMar>
+              <w:top w:type="dxa" w:w="80"/>
+              <w:left w:type="dxa" w:w="120"/>
+              <w:bottom w:type="dxa" w:w="80"/>
+              <w:right w:type="dxa" w:w="120"/>
+            </w:tcMar>
+          </w:tcPr>
+          <w:p>
+            <w:r>
+              <w:rPr>
+                <w:b w:val="false"/>
+                <w:bCs w:val="false"/>
+                <w:sz w:val="20"/>
+                <w:szCs w:val="20"/>
+              </w:rPr>
+              <w:t xml:space="preserve">15/06/2026</w:t>
+            </w:r>
+          </w:p>
+        </w:tc>
+        <w:tc>
+          <w:tcPr>
+            <w:tcW w:type="dxa" w:w="3160"/>
+            <w:tcBorders>
+              <w:top w:val="single" w:color="CCCCCC" w:sz="1"/>
+              <w:left w:val="single" w:color="CCCCCC" w:sz="1"/>
+              <w:bottom w:val="single" w:color="CCCCCC" w:sz="1"/>
+              <w:right w:val="single" w:color="CCCCCC" w:sz="1"/>
+            </w:tcBorders>
+            <w:tcMar>
+              <w:top w:type="dxa" w:w="80"/>
+              <w:left w:type="dxa" w:w="120"/>
+              <w:bottom w:type="dxa" w:w="80"/>
+              <w:right w:type="dxa" w:w="120"/>
+            </w:tcMar>
+          </w:tcPr>
+          <w:p>
+            <w:r>
+              <w:rPr>
+                <w:b w:val="false"/>
+                <w:bCs w:val="false"/>
+                <w:sz w:val="20"/>
+                <w:szCs w:val="20"/>
+              </w:rPr>
+              <w:t xml:space="preserve">DATE vs NUMBER</w:t>
+            </w:r>
+          </w:p>
+        </w:tc>
+        <w:tc>
+          <w:tcPr>
+            <w:tcW w:type="dxa" w:w="1600"/>
+            <w:tcBorders>
+              <w:top w:val="single" w:color="CCCCCC" w:sz="1"/>
+              <w:left w:val="single" w:color="CCCCCC" w:sz="1"/>
+              <w:bottom w:val="single" w:color="CCCCCC" w:sz="1"/>
+              <w:right w:val="single" w:color="CCCCCC" w:sz="1"/>
+            </w:tcBorders>
+            <w:tcMar>
+              <w:top w:type="dxa" w:w="80"/>
+              <w:left w:type="dxa" w:w="120"/>
+              <w:bottom w:type="dxa" w:w="80"/>
+              <w:right w:type="dxa" w:w="120"/>
+            </w:tcMar>
+          </w:tcPr>
+          <w:p>
+            <w:r>
+              <w:rPr>
+                <w:b w:val="false"/>
+                <w:bCs w:val="false"/>
+                <w:sz w:val="20"/>
+                <w:szCs w:val="20"/>
+              </w:rPr>
+              <w:t xml:space="preserve">DATE</w:t>
+            </w:r>
+          </w:p>
+        </w:tc>
+        <w:tc>
+          <w:tcPr>
+            <w:tcW w:type="dxa" w:w="2200"/>
+            <w:tcBorders>
+              <w:top w:val="single" w:color="CCCCCC" w:sz="1"/>
+              <w:left w:val="single" w:color="CCCCCC" w:sz="1"/>
+              <w:bottom w:val="single" w:color="CCCCCC" w:sz="1"/>
+              <w:right w:val="single" w:color="CCCCCC" w:sz="1"/>
+            </w:tcBorders>
+            <w:tcMar>
+              <w:top w:type="dxa" w:w="80"/>
+              <w:left w:type="dxa" w:w="120"/>
+              <w:bottom w:type="dxa" w:w="80"/>
+              <w:right w:type="dxa" w:w="120"/>
+            </w:tcMar>
+          </w:tcPr>
+          <w:p>
+            <w:r>
+              <w:rPr>
+                <w:b w:val="false"/>
+                <w:bCs w:val="false"/>
+                <w:sz w:val="20"/>
+                <w:szCs w:val="20"/>
+              </w:rPr>
+              <w:t xml:space="preserve">Longueur</w:t>
+            </w:r>
+          </w:p>
+        </w:tc>
+      </w:tr>
+      <w:tr>
+        <w:tc>
+          <w:tcPr>
+            <w:tcW w:type="dxa" w:w="2400"/>
+            <w:tcBorders>
+              <w:top w:val="single" w:color="CCCCCC" w:sz="1"/>
+              <w:left w:val="single" w:color="CCCCCC" w:sz="1"/>
+              <w:bottom w:val="single" w:color="CCCCCC" w:sz="1"/>
+              <w:right w:val="single" w:color="CCCCCC" w:sz="1"/>
+            </w:tcBorders>
+            <w:tcMar>
+              <w:top w:type="dxa" w:w="80"/>
+              <w:left w:type="dxa" w:w="120"/>
+              <w:bottom w:type="dxa" w:w="80"/>
+              <w:right w:type="dxa" w:w="120"/>
+            </w:tcMar>
+          </w:tcPr>
+          <w:p>
+            <w:r>
+              <w:rPr>
+                <w:b w:val="false"/>
+                <w:bCs w:val="false"/>
+                <w:sz w:val="20"/>
+                <w:szCs w:val="20"/>
+              </w:rPr>
+              <w:t xml:space="preserve">Élève</w:t>
+            </w:r>
+          </w:p>
+        </w:tc>
+        <w:tc>
+          <w:tcPr>
+            <w:tcW w:type="dxa" w:w="3160"/>
+            <w:tcBorders>
+              <w:top w:val="single" w:color="CCCCCC" w:sz="1"/>
+              <w:left w:val="single" w:color="CCCCCC" w:sz="1"/>
+              <w:bottom w:val="single" w:color="CCCCCC" w:sz="1"/>
+              <w:right w:val="single" w:color="CCCCCC" w:sz="1"/>
+            </w:tcBorders>
+            <w:tcMar>
+              <w:top w:type="dxa" w:w="80"/>
+              <w:left w:type="dxa" w:w="120"/>
+              <w:bottom w:type="dxa" w:w="80"/>
+              <w:right w:type="dxa" w:w="120"/>
+            </w:tcMar>
+          </w:tcPr>
+          <w:p>
+            <w:r>
+              <w:rPr>
+                <w:b w:val="false"/>
+                <w:bCs w:val="false"/>
+                <w:sz w:val="20"/>
+                <w:szCs w:val="20"/>
+              </w:rPr>
+              <w:t xml:space="preserve">PERSON vs WORD</w:t>
+            </w:r>
+          </w:p>
+        </w:tc>
+        <w:tc>
+          <w:tcPr>
+            <w:tcW w:type="dxa" w:w="1600"/>
+            <w:tcBorders>
+              <w:top w:val="single" w:color="CCCCCC" w:sz="1"/>
+              <w:left w:val="single" w:color="CCCCCC" w:sz="1"/>
+              <w:bottom w:val="single" w:color="CCCCCC" w:sz="1"/>
+              <w:right w:val="single" w:color="CCCCCC" w:sz="1"/>
+            </w:tcBorders>
+            <w:tcMar>
+              <w:top w:type="dxa" w:w="80"/>
+              <w:left w:type="dxa" w:w="120"/>
+              <w:bottom w:type="dxa" w:w="80"/>
+              <w:right w:type="dxa" w:w="120"/>
+            </w:tcMar>
+          </w:tcPr>
+          <w:p>
+            <w:r>
+              <w:rPr>
+                <w:b w:val="false"/>
+                <w:bCs w:val="false"/>
+                <w:sz w:val="20"/>
+                <w:szCs w:val="20"/>
+              </w:rPr>
+              <w:t xml:space="preserve">PERSON</w:t>
+            </w:r>
+          </w:p>
+        </w:tc>
+        <w:tc>
+          <w:tcPr>
+            <w:tcW w:type="dxa" w:w="2200"/>
+            <w:tcBorders>
+              <w:top w:val="single" w:color="CCCCCC" w:sz="1"/>
+              <w:left w:val="single" w:color="CCCCCC" w:sz="1"/>
+              <w:bottom w:val="single" w:color="CCCCCC" w:sz="1"/>
+              <w:right w:val="single" w:color="CCCCCC" w:sz="1"/>
+            </w:tcBorders>
+            <w:tcMar>
+              <w:top w:type="dxa" w:w="80"/>
+              <w:left w:type="dxa" w:w="120"/>
+              <w:bottom w:type="dxa" w:w="80"/>
+              <w:right w:type="dxa" w:w="120"/>
+            </w:tcMar>
+          </w:tcPr>
+          <w:p>
+            <w:r>
+              <w:rPr>
+                <w:b w:val="false"/>
+                <w:bCs w:val="false"/>
+                <w:sz w:val="20"/>
+                <w:szCs w:val="20"/>
+              </w:rPr>
+              <w:t xml:space="preserve">Ordre (égalité)</w:t>
+            </w:r>
+          </w:p>
+        </w:tc>
+      </w:tr>
+    </w:tbl>
+    <w:p>
+      <w:pPr>
+        <w:spacing w:after="160"/>
+      </w:pPr>
+      <w:r>
+        <w:t xml:space="preserve">Cas notable : « Aujourd'hui » — PERSON s'arrête à l'apostrophe (« Aujourd », 7 car.) tandis que WORD l'inclut (« Aujourd'hui », 11 car.). WORD l'emporte par la longueur bien que PERSON soit déclaré avant : effet de bord bénéfique, puisque d'Afrique, l'Ouest, l'Université, rendez-vous restent des WORD (conservés) grâce à l'« effet de colle » de l'apostrophe et du tiret.</w:t>
+      </w:r>
+    </w:p>
+    <w:p>
+      <w:pPr>
+        <w:pStyle w:val="Heading2"/>
+      </w:pPr>
+      <w:r>
+        <w:t xml:space="preserve">5.3 Ambiguïté résiduelle : la majuscule en début de phrase</w:t>
+      </w:r>
+    </w:p>
+    <w:p>
+      <w:pPr>
+        <w:spacing w:after="160"/>
+      </w:pPr>
+      <w:r>
+        <w:t xml:space="preserve">Le Maximal Munch ne peut pas distinguer un vrai nom propre (Awa) d'un mot outil capitalisé en tête de phrase (Le, Son, Numéro, Bienvenue, Élève) : cette ambiguïté est contextuelle, donc hors de portée du lexer seul.</w:t>
+      </w:r>
+    </w:p>
+    <w:p>
+      <w:pPr>
+        <w:spacing w:after="160"/>
+      </w:pPr>
+      <w:r>
+        <w:t xml:space="preserve">Elle est levée en aval, à l'anonymisation, par une heuristique combinant la position (un PERSON en tête de phrase est candidat à la conservation) et un lexique de mots outils (MOTS_OUTILS dans Anonymizer.jj) : le token n'est conservé que s'il figure dans cette liste.</w:t>
       </w:r>
     </w:p>
     <w:p>
@@ -791,7 +3130,7 @@
         <w:spacing w:after="80"/>
       </w:pPr>
       <w:r>
-        <w:t xml:space="preserve">Main — point d'entrée, gestion des arguments (fichier d'entrée / sortie).</w:t>
+        <w:t xml:space="preserve">Le, Son, Numéro, Bienvenue, Élève (tête de phrase + mot outil) → conservés.</w:t>
       </w:r>
     </w:p>
     <w:p>
@@ -804,7 +3143,7 @@
         <w:spacing w:after="80"/>
       </w:pPr>
       <w:r>
-        <w:t xml:space="preserve">Anonymizer — cœur du traitement : lecture du fichier, génération des tokens, anonymisation, écriture du résultat.</w:t>
+        <w:t xml:space="preserve">Awa (tête de phrase, absent du lexique) → anonymisé &lt;PERSONNE&gt; — correct, c'est un prénom.</w:t>
       </w:r>
     </w:p>
     <w:p>
@@ -817,7 +3156,36 @@
         <w:spacing w:after="80"/>
       </w:pPr>
       <w:r>
-        <w:t xml:space="preserve">Token — représentation d'un token (type + lexème).</w:t>
+        <w:t xml:space="preserve">Amadou, Diallo (hors tête de phrase) → anonymisés.</w:t>
+      </w:r>
+    </w:p>
+    <w:p>
+      <w:pPr>
+        <w:spacing w:after="160"/>
+      </w:pPr>
+      <w:r>
+        <w:t xml:space="preserve">Limite connue (reprise en Partie 10) : un nom propre en milieu de phrase désignant un lieu (Dakar, Sénégal) est classé &lt;PERSONNE&gt; faute de lexique géographique.</w:t>
+      </w:r>
+    </w:p>
+    <w:p>
+      <w:pPr>
+        <w:pStyle w:val="Heading1"/>
+      </w:pPr>
+      <w:r>
+        <w:t xml:space="preserve">Partie 6 — Analyse syntaxique</w:t>
+      </w:r>
+    </w:p>
+    <w:p>
+      <w:pPr>
+        <w:spacing w:after="160"/>
+      </w:pPr>
+      <w:r>
+        <w:rPr>
+          <w:i/>
+          <w:iCs/>
+          <w:color w:val="555555"/>
+        </w:rPr>
+        <w:t xml:space="preserve">Responsable : Membre 2 — productions Document / Element / PersonName dans grammar/Anonymizer.jj.</w:t>
       </w:r>
     </w:p>
     <w:p>
@@ -825,7 +3193,7 @@
         <w:pStyle w:val="Heading2"/>
       </w:pPr>
       <w:r>
-        <w:t xml:space="preserve">7.2 État d'avancement</w:t>
+        <w:t xml:space="preserve">6.1 Objectif</w:t>
       </w:r>
     </w:p>
     <w:p>
@@ -833,7 +3201,267 @@
         <w:spacing w:after="160"/>
       </w:pPr>
       <w:r>
-        <w:t xml:space="preserve">À ce stade, la chaîne lecture → génération de tokens → écriture du fichier de sortie est fonctionnelle et testée sur l'exemple du sujet (test1_exemple_sujet.txt).</w:t>
+        <w:t xml:space="preserve">Après le découpage lexical (Partie 4), l'analyse syntaxique vérifie que la suite de tokens forme un document valide et la structure. Le texte à anonymiser étant libre, la grammaire accepte toute séquence de tokens ; son intérêt est surtout de regrouper les noms propres consécutifs (éventuellement précédés d'une civilité) en une entité PersonName.</w:t>
+      </w:r>
+    </w:p>
+    <w:p>
+      <w:pPr>
+        <w:pStyle w:val="Heading2"/>
+      </w:pPr>
+      <w:r>
+        <w:t xml:space="preserve">6.2 Grammaire</w:t>
+      </w:r>
+    </w:p>
+    <w:p>
+      <w:pPr>
+        <w:shd w:fill="F2F2F2" w:val="clear"/>
+        <w:spacing w:after="0"/>
+      </w:pPr>
+      <w:r>
+        <w:rPr>
+          <w:rFonts w:ascii="Consolas" w:cs="Consolas" w:eastAsia="Consolas" w:hAnsi="Consolas"/>
+          <w:sz w:val="18"/>
+          <w:szCs w:val="18"/>
+        </w:rPr>
+        <w:t xml:space="preserve">Document   ::= ( Element )* &lt;EOF&gt;</w:t>
+      </w:r>
+    </w:p>
+    <w:p>
+      <w:pPr>
+        <w:shd w:fill="F2F2F2" w:val="clear"/>
+        <w:spacing w:after="0"/>
+      </w:pPr>
+      <w:r>
+        <w:rPr>
+          <w:rFonts w:ascii="Consolas" w:cs="Consolas" w:eastAsia="Consolas" w:hAnsi="Consolas"/>
+          <w:sz w:val="18"/>
+          <w:szCs w:val="18"/>
+        </w:rPr>
+        <w:t xml:space="preserve"> </w:t>
+      </w:r>
+    </w:p>
+    <w:p>
+      <w:pPr>
+        <w:shd w:fill="F2F2F2" w:val="clear"/>
+        <w:spacing w:after="0"/>
+      </w:pPr>
+      <w:r>
+        <w:rPr>
+          <w:rFonts w:ascii="Consolas" w:cs="Consolas" w:eastAsia="Consolas" w:hAnsi="Consolas"/>
+          <w:sz w:val="18"/>
+          <w:szCs w:val="18"/>
+        </w:rPr>
+        <w:t xml:space="preserve">Element    ::= &lt;EMAIL&gt; | &lt;PHONE&gt; | &lt;DATE&gt; | &lt;AMOUNT&gt;</w:t>
+      </w:r>
+    </w:p>
+    <w:p>
+      <w:pPr>
+        <w:shd w:fill="F2F2F2" w:val="clear"/>
+        <w:spacing w:after="0"/>
+      </w:pPr>
+      <w:r>
+        <w:rPr>
+          <w:rFonts w:ascii="Consolas" w:cs="Consolas" w:eastAsia="Consolas" w:hAnsi="Consolas"/>
+          <w:sz w:val="18"/>
+          <w:szCs w:val="18"/>
+        </w:rPr>
+        <w:t xml:space="preserve">             | PersonName | &lt;WORD&gt; | &lt;NUMBER&gt; | &lt;OTHER&gt;</w:t>
+      </w:r>
+    </w:p>
+    <w:p>
+      <w:pPr>
+        <w:shd w:fill="F2F2F2" w:val="clear"/>
+        <w:spacing w:after="0"/>
+      </w:pPr>
+      <w:r>
+        <w:rPr>
+          <w:rFonts w:ascii="Consolas" w:cs="Consolas" w:eastAsia="Consolas" w:hAnsi="Consolas"/>
+          <w:sz w:val="18"/>
+          <w:szCs w:val="18"/>
+        </w:rPr>
+        <w:t xml:space="preserve"> </w:t>
+      </w:r>
+    </w:p>
+    <w:p>
+      <w:pPr>
+        <w:shd w:fill="F2F2F2" w:val="clear"/>
+        <w:spacing w:after="0"/>
+      </w:pPr>
+      <w:r>
+        <w:rPr>
+          <w:rFonts w:ascii="Consolas" w:cs="Consolas" w:eastAsia="Consolas" w:hAnsi="Consolas"/>
+          <w:sz w:val="18"/>
+          <w:szCs w:val="18"/>
+        </w:rPr>
+        <w:t xml:space="preserve">PersonName ::= &lt;TITLE&gt; &lt;PERSON&gt; ( &lt;PERSON&gt; )*     (civilité + nom composé)</w:t>
+      </w:r>
+    </w:p>
+    <w:p>
+      <w:pPr>
+        <w:shd w:fill="F2F2F2" w:val="clear"/>
+        <w:spacing w:after="0"/>
+      </w:pPr>
+      <w:r>
+        <w:rPr>
+          <w:rFonts w:ascii="Consolas" w:cs="Consolas" w:eastAsia="Consolas" w:hAnsi="Consolas"/>
+          <w:sz w:val="18"/>
+          <w:szCs w:val="18"/>
+        </w:rPr>
+        <w:t xml:space="preserve">             | &lt;PERSON&gt; ( &lt;PERSON&gt; )*             (nom composé)</w:t>
+      </w:r>
+    </w:p>
+    <w:p>
+      <w:pPr>
+        <w:shd w:fill="F2F2F2" w:val="clear"/>
+        <w:spacing w:after="200"/>
+      </w:pPr>
+      <w:r>
+        <w:rPr>
+          <w:rFonts w:ascii="Consolas" w:cs="Consolas" w:eastAsia="Consolas" w:hAnsi="Consolas"/>
+          <w:sz w:val="18"/>
+          <w:szCs w:val="18"/>
+        </w:rPr>
+        <w:t xml:space="preserve">             | &lt;TITLE&gt;                            (civilité isolée)</w:t>
+      </w:r>
+    </w:p>
+    <w:p>
+      <w:pPr>
+        <w:pStyle w:val="Heading2"/>
+      </w:pPr>
+      <w:r>
+        <w:t xml:space="preserve">6.3 Traduction JavaCC et rôle des LOOKAHEAD</w:t>
+      </w:r>
+    </w:p>
+    <w:p>
+      <w:pPr>
+        <w:shd w:fill="F2F2F2" w:val="clear"/>
+        <w:spacing w:after="0"/>
+      </w:pPr>
+      <w:r>
+        <w:rPr>
+          <w:rFonts w:ascii="Consolas" w:cs="Consolas" w:eastAsia="Consolas" w:hAnsi="Consolas"/>
+          <w:sz w:val="18"/>
+          <w:szCs w:val="18"/>
+        </w:rPr>
+        <w:t xml:space="preserve">void PersonName() : {}</w:t>
+      </w:r>
+    </w:p>
+    <w:p>
+      <w:pPr>
+        <w:shd w:fill="F2F2F2" w:val="clear"/>
+        <w:spacing w:after="0"/>
+      </w:pPr>
+      <w:r>
+        <w:rPr>
+          <w:rFonts w:ascii="Consolas" w:cs="Consolas" w:eastAsia="Consolas" w:hAnsi="Consolas"/>
+          <w:sz w:val="18"/>
+          <w:szCs w:val="18"/>
+        </w:rPr>
+        <w:t xml:space="preserve">{</w:t>
+      </w:r>
+    </w:p>
+    <w:p>
+      <w:pPr>
+        <w:shd w:fill="F2F2F2" w:val="clear"/>
+        <w:spacing w:after="0"/>
+      </w:pPr>
+      <w:r>
+        <w:rPr>
+          <w:rFonts w:ascii="Consolas" w:cs="Consolas" w:eastAsia="Consolas" w:hAnsi="Consolas"/>
+          <w:sz w:val="18"/>
+          <w:szCs w:val="18"/>
+        </w:rPr>
+        <w:t xml:space="preserve">    LOOKAHEAD( &lt;TITLE&gt; &lt;PERSON&gt; ) &lt;TITLE&gt; &lt;PERSON&gt; ( LOOKAHEAD(1) &lt;PERSON&gt; )*</w:t>
+      </w:r>
+    </w:p>
+    <w:p>
+      <w:pPr>
+        <w:shd w:fill="F2F2F2" w:val="clear"/>
+        <w:spacing w:after="0"/>
+      </w:pPr>
+      <w:r>
+        <w:rPr>
+          <w:rFonts w:ascii="Consolas" w:cs="Consolas" w:eastAsia="Consolas" w:hAnsi="Consolas"/>
+          <w:sz w:val="18"/>
+          <w:szCs w:val="18"/>
+        </w:rPr>
+        <w:t xml:space="preserve">  | &lt;PERSON&gt; ( LOOKAHEAD(1) &lt;PERSON&gt; )*</w:t>
+      </w:r>
+    </w:p>
+    <w:p>
+      <w:pPr>
+        <w:shd w:fill="F2F2F2" w:val="clear"/>
+        <w:spacing w:after="0"/>
+      </w:pPr>
+      <w:r>
+        <w:rPr>
+          <w:rFonts w:ascii="Consolas" w:cs="Consolas" w:eastAsia="Consolas" w:hAnsi="Consolas"/>
+          <w:sz w:val="18"/>
+          <w:szCs w:val="18"/>
+        </w:rPr>
+        <w:t xml:space="preserve">  | &lt;TITLE&gt;</w:t>
+      </w:r>
+    </w:p>
+    <w:p>
+      <w:pPr>
+        <w:shd w:fill="F2F2F2" w:val="clear"/>
+        <w:spacing w:after="200"/>
+      </w:pPr>
+      <w:r>
+        <w:rPr>
+          <w:rFonts w:ascii="Consolas" w:cs="Consolas" w:eastAsia="Consolas" w:hAnsi="Consolas"/>
+          <w:sz w:val="18"/>
+          <w:szCs w:val="18"/>
+        </w:rPr>
+        <w:t xml:space="preserve">}</w:t>
+      </w:r>
+    </w:p>
+    <w:p>
+      <w:pPr>
+        <w:spacing w:after="160"/>
+      </w:pPr>
+      <w:r>
+        <w:t xml:space="preserve">LOOKAHEAD(&lt;TITLE&gt; &lt;PERSON&gt;) départage « civilité suivie d'un nom » de « civilité isolée » (les deux commencent par &lt;TITLE&gt;). LOOKAHEAD(1) &lt;PERSON&gt; dans les répétitions rend explicite le choix glouton de continuer à empiler les noms propres d'un nom composé (ex. Cheikh Anta Diop = 3 PERSON consécutifs) ; la grammaire compile ainsi sans aucun avertissement de conflit.</w:t>
+      </w:r>
+    </w:p>
+    <w:p>
+      <w:pPr>
+        <w:pStyle w:val="Heading2"/>
+      </w:pPr>
+      <w:r>
+        <w:t xml:space="preserve">6.4 Validation</w:t>
+      </w:r>
+    </w:p>
+    <w:p>
+      <w:pPr>
+        <w:spacing w:after="160"/>
+      </w:pPr>
+      <w:r>
+        <w:t xml:space="preserve">La méthode main de AnonymizerParser appelle Document() sur chaque fichier de test et affiche « Analyse syntaxique : OK (suite de tokens valide) », confirmant que la suite de tokens produite par le lexer est acceptée par la grammaire pour les 5 fichiers de test/input/.</w:t>
+      </w:r>
+    </w:p>
+    <w:p>
+      <w:pPr>
+        <w:pStyle w:val="Heading1"/>
+      </w:pPr>
+      <w:r>
+        <w:t xml:space="preserve">Partie 7 — Implémentation</w:t>
+      </w:r>
+    </w:p>
+    <w:p>
+      <w:pPr>
+        <w:pStyle w:val="Heading2"/>
+      </w:pPr>
+      <w:r>
+        <w:t xml:space="preserve">7.1 Architecture</w:t>
+      </w:r>
+    </w:p>
+    <w:p>
+      <w:pPr>
+        <w:spacing w:after="160"/>
+      </w:pPr>
+      <w:r>
+        <w:t xml:space="preserve">Le programme est organisé en trois classes Java, dans le paquetage anonymizer :</w:t>
       </w:r>
     </w:p>
     <w:p>
@@ -846,7 +3474,7 @@
         <w:spacing w:after="80"/>
       </w:pPr>
       <w:r>
-        <w:t xml:space="preserve">Lecture d'un fichier texte : implémentée (Anonymizer.readFile).</w:t>
+        <w:t xml:space="preserve">Main — point d'entrée, gestion des arguments (fichier d'entrée / sortie).</w:t>
       </w:r>
     </w:p>
     <w:p>
@@ -859,7 +3487,7 @@
         <w:spacing w:after="80"/>
       </w:pPr>
       <w:r>
-        <w:t xml:space="preserve">Génération des tokens : version provisoire par découpage naïf (regex), en attendant l'intégration du lexer généré par JavaCC (Partie 4/6, Membre 2).</w:t>
+        <w:t xml:space="preserve">Anonymizer — cœur du traitement : lecture du fichier, génération des tokens, anonymisation, écriture du résultat.</w:t>
       </w:r>
     </w:p>
     <w:p>
@@ -872,7 +3500,23 @@
         <w:spacing w:after="80"/>
       </w:pPr>
       <w:r>
-        <w:t xml:space="preserve">Anonymisation : non encore implémentée — dépend de la classification réelle des tokens.</w:t>
+        <w:t xml:space="preserve">Token — représentation d'un token (type + lexème).</w:t>
+      </w:r>
+    </w:p>
+    <w:p>
+      <w:pPr>
+        <w:pStyle w:val="Heading2"/>
+      </w:pPr>
+      <w:r>
+        <w:t xml:space="preserve">7.2 Intégration du lexer JavaCC (M2)</w:t>
+      </w:r>
+    </w:p>
+    <w:p>
+      <w:pPr>
+        <w:spacing w:after="160"/>
+      </w:pPr>
+      <w:r>
+        <w:t xml:space="preserve">Le lexer/parser généré par JavaCC à partir de grammar/Anonymizer.jj (Membre 2, Parties 4/5/6) est intégré à l'implémentation M3 dans le paquetage anonymizer.lexer :</w:t>
       </w:r>
     </w:p>
     <w:p>
@@ -885,21 +3529,471 @@
         <w:spacing w:after="80"/>
       </w:pPr>
       <w:r>
+        <w:t xml:space="preserve">Lecture d'un fichier texte : implémentée (Anonymizer.readFile).</w:t>
+      </w:r>
+    </w:p>
+    <w:p>
+      <w:pPr>
+        <w:pStyle w:val="ListParagraph"/>
+        <w:numPr>
+          <w:ilvl w:val="0"/>
+          <w:numId w:val="2"/>
+        </w:numPr>
+        <w:spacing w:after="80"/>
+      </w:pPr>
+      <w:r>
+        <w:t xml:space="preserve">Génération des tokens : Anonymizer.generateTokens() pilote directement AnonymizerParserTokenManager (classe générée par JavaCC) et classe chaque lexème via AnonymizerParserConstants.tokenImage.</w:t>
+      </w:r>
+    </w:p>
+    <w:p>
+      <w:pPr>
+        <w:pStyle w:val="ListParagraph"/>
+        <w:numPr>
+          <w:ilvl w:val="0"/>
+          <w:numId w:val="2"/>
+        </w:numPr>
+        <w:spacing w:after="80"/>
+      </w:pPr>
+      <w:r>
+        <w:t xml:space="preserve">Anonymisation : Anonymizer.anonymize() délègue à anonymizer.lexer.AnonymizerParser.anonymize(texte), qui applique la classification lexicale pour remplacer EMAIL/PHONE/DATE/AMOUNT/PERSON par leurs marqueurs et supprimer les civilités (TITLE).</w:t>
+      </w:r>
+    </w:p>
+    <w:p>
+      <w:pPr>
+        <w:pStyle w:val="ListParagraph"/>
+        <w:numPr>
+          <w:ilvl w:val="0"/>
+          <w:numId w:val="2"/>
+        </w:numPr>
+        <w:spacing w:after="80"/>
+      </w:pPr>
+      <w:r>
         <w:t xml:space="preserve">Production du fichier de sortie : implémentée (Anonymizer.writeFile).</w:t>
       </w:r>
     </w:p>
     <w:p>
       <w:pPr>
-        <w:shd w:fill="FFF2CC" w:val="clear"/>
+        <w:spacing w:after="160"/>
+      </w:pPr>
+      <w:r>
+        <w:t xml:space="preserve">Chaîne complète opérationnelle : lecture → tokens → anonymisation → écriture, compilée et exécutée avec succès sur les 5 fichiers de test/input/ (voir Partie 9).</w:t>
+      </w:r>
+    </w:p>
+    <w:p>
+      <w:pPr>
+        <w:shd w:fill="F2F2F2" w:val="clear"/>
+        <w:spacing w:after="0"/>
+      </w:pPr>
+      <w:r>
+        <w:rPr>
+          <w:rFonts w:ascii="Consolas" w:cs="Consolas" w:eastAsia="Consolas" w:hAnsi="Consolas"/>
+          <w:sz w:val="18"/>
+          <w:szCs w:val="18"/>
+        </w:rPr>
+        <w:t xml:space="preserve">// Build (voir grammar/build.sh ou build.ps1) :</w:t>
+      </w:r>
+    </w:p>
+    <w:p>
+      <w:pPr>
+        <w:shd w:fill="F2F2F2" w:val="clear"/>
+        <w:spacing w:after="0"/>
+      </w:pPr>
+      <w:r>
+        <w:rPr>
+          <w:rFonts w:ascii="Consolas" w:cs="Consolas" w:eastAsia="Consolas" w:hAnsi="Consolas"/>
+          <w:sz w:val="18"/>
+          <w:szCs w:val="18"/>
+        </w:rPr>
+        <w:t xml:space="preserve">java -cp lib/javacc.jar javacc -OUTPUT_DIRECTORY=grammar grammar/Anonymizer.jj</w:t>
+      </w:r>
+    </w:p>
+    <w:p>
+      <w:pPr>
+        <w:shd w:fill="F2F2F2" w:val="clear"/>
+        <w:spacing w:after="0"/>
+      </w:pPr>
+      <w:r>
+        <w:rPr>
+          <w:rFonts w:ascii="Consolas" w:cs="Consolas" w:eastAsia="Consolas" w:hAnsi="Consolas"/>
+          <w:sz w:val="18"/>
+          <w:szCs w:val="18"/>
+        </w:rPr>
+        <w:t xml:space="preserve">javac -encoding UTF-8 -d out grammar/*.java src/main/java/anonymizer/*.java</w:t>
+      </w:r>
+    </w:p>
+    <w:p>
+      <w:pPr>
+        <w:shd w:fill="F2F2F2" w:val="clear"/>
+        <w:spacing w:after="0"/>
+      </w:pPr>
+      <w:r>
+        <w:rPr>
+          <w:rFonts w:ascii="Consolas" w:cs="Consolas" w:eastAsia="Consolas" w:hAnsi="Consolas"/>
+          <w:sz w:val="18"/>
+          <w:szCs w:val="18"/>
+        </w:rPr>
+        <w:t xml:space="preserve"> </w:t>
+      </w:r>
+    </w:p>
+    <w:p>
+      <w:pPr>
+        <w:shd w:fill="F2F2F2" w:val="clear"/>
+        <w:spacing w:after="0"/>
+      </w:pPr>
+      <w:r>
+        <w:rPr>
+          <w:rFonts w:ascii="Consolas" w:cs="Consolas" w:eastAsia="Consolas" w:hAnsi="Consolas"/>
+          <w:sz w:val="18"/>
+          <w:szCs w:val="18"/>
+        </w:rPr>
+        <w:t xml:space="preserve">// Exécution :</w:t>
+      </w:r>
+    </w:p>
+    <w:p>
+      <w:pPr>
+        <w:shd w:fill="F2F2F2" w:val="clear"/>
         <w:spacing w:after="200"/>
+      </w:pPr>
+      <w:r>
+        <w:rPr>
+          <w:rFonts w:ascii="Consolas" w:cs="Consolas" w:eastAsia="Consolas" w:hAnsi="Consolas"/>
+          <w:sz w:val="18"/>
+          <w:szCs w:val="18"/>
+        </w:rPr>
+        <w:t xml:space="preserve">java -cp out anonymizer.Main test/input/test1_exemple_sujet.txt</w:t>
+      </w:r>
+    </w:p>
+    <w:p>
+      <w:pPr>
+        <w:pStyle w:val="Heading1"/>
+      </w:pPr>
+      <w:r>
+        <w:t xml:space="preserve">Partie 8 — Instrumentation</w:t>
+      </w:r>
+    </w:p>
+    <w:p>
+      <w:pPr>
+        <w:spacing w:after="160"/>
       </w:pPr>
       <w:r>
         <w:rPr>
           <w:i/>
           <w:iCs/>
-          <w:color w:val="7F6000"/>
-        </w:rPr>
-        <w:t xml:space="preserve">À COMPLÉTER — Membre 3 — compléter cette section une fois le lexer JavaCC intégré : remplacer generateRawTokens() par le TokenManager généré, implémenter anonymize() avec les vrais marqueurs, ajouter un extrait de code commenté.</w:t>
+          <w:color w:val="555555"/>
+        </w:rPr>
+        <w:t xml:space="preserve">Responsable : Membre 2 — méthode instrument(...) de grammar/Anonymizer.jj.</w:t>
+      </w:r>
+    </w:p>
+    <w:p>
+      <w:pPr>
+        <w:pStyle w:val="Heading2"/>
+      </w:pPr>
+      <w:r>
+        <w:t xml:space="preserve">8.1 Objectif et mécanisme</w:t>
+      </w:r>
+    </w:p>
+    <w:p>
+      <w:pPr>
+        <w:spacing w:after="160"/>
+      </w:pPr>
+      <w:r>
+        <w:t xml:space="preserve">L'instrumentation rend visible le travail de l'analyseur lexical : pour chaque token reconnu, elle affiche son type et son lexème. Le token manager généré par JavaCC est appelé directement, token par token, jusqu'à EOF ; les tokens purement blancs (espaces, retours à la ligne) ne sont pas listés, pour la lisibilité.</w:t>
+      </w:r>
+    </w:p>
+    <w:p>
+      <w:pPr>
+        <w:shd w:fill="F2F2F2" w:val="clear"/>
+        <w:spacing w:after="0"/>
+      </w:pPr>
+      <w:r>
+        <w:rPr>
+          <w:rFonts w:ascii="Consolas" w:cs="Consolas" w:eastAsia="Consolas" w:hAnsi="Consolas"/>
+          <w:sz w:val="18"/>
+          <w:szCs w:val="18"/>
+        </w:rPr>
+        <w:t xml:space="preserve">AnonymizerParserTokenManager lexer = newLexer(texte);</w:t>
+      </w:r>
+    </w:p>
+    <w:p>
+      <w:pPr>
+        <w:shd w:fill="F2F2F2" w:val="clear"/>
+        <w:spacing w:after="0"/>
+      </w:pPr>
+      <w:r>
+        <w:rPr>
+          <w:rFonts w:ascii="Consolas" w:cs="Consolas" w:eastAsia="Consolas" w:hAnsi="Consolas"/>
+          <w:sz w:val="18"/>
+          <w:szCs w:val="18"/>
+        </w:rPr>
+        <w:t xml:space="preserve">Token t;</w:t>
+      </w:r>
+    </w:p>
+    <w:p>
+      <w:pPr>
+        <w:shd w:fill="F2F2F2" w:val="clear"/>
+        <w:spacing w:after="0"/>
+      </w:pPr>
+      <w:r>
+        <w:rPr>
+          <w:rFonts w:ascii="Consolas" w:cs="Consolas" w:eastAsia="Consolas" w:hAnsi="Consolas"/>
+          <w:sz w:val="18"/>
+          <w:szCs w:val="18"/>
+        </w:rPr>
+        <w:t xml:space="preserve">while ((t = lexer.getNextToken()).kind != EOF) {</w:t>
+      </w:r>
+    </w:p>
+    <w:p>
+      <w:pPr>
+        <w:shd w:fill="F2F2F2" w:val="clear"/>
+        <w:spacing w:after="0"/>
+      </w:pPr>
+      <w:r>
+        <w:rPr>
+          <w:rFonts w:ascii="Consolas" w:cs="Consolas" w:eastAsia="Consolas" w:hAnsi="Consolas"/>
+          <w:sz w:val="18"/>
+          <w:szCs w:val="18"/>
+        </w:rPr>
+        <w:t xml:space="preserve">    if (t.image.trim().isEmpty()) continue;</w:t>
+      </w:r>
+    </w:p>
+    <w:p>
+      <w:pPr>
+        <w:shd w:fill="F2F2F2" w:val="clear"/>
+        <w:spacing w:after="0"/>
+      </w:pPr>
+      <w:r>
+        <w:rPr>
+          <w:rFonts w:ascii="Consolas" w:cs="Consolas" w:eastAsia="Consolas" w:hAnsi="Consolas"/>
+          <w:sz w:val="18"/>
+          <w:szCs w:val="18"/>
+        </w:rPr>
+        <w:t xml:space="preserve">    System.out.println("  [" + nomType(t.kind) + " : \"" + t.image + "\"]");</w:t>
+      </w:r>
+    </w:p>
+    <w:p>
+      <w:pPr>
+        <w:shd w:fill="F2F2F2" w:val="clear"/>
+        <w:spacing w:after="200"/>
+      </w:pPr>
+      <w:r>
+        <w:rPr>
+          <w:rFonts w:ascii="Consolas" w:cs="Consolas" w:eastAsia="Consolas" w:hAnsi="Consolas"/>
+          <w:sz w:val="18"/>
+          <w:szCs w:val="18"/>
+        </w:rPr>
+        <w:t xml:space="preserve">}</w:t>
+      </w:r>
+    </w:p>
+    <w:p>
+      <w:pPr>
+        <w:pStyle w:val="Heading2"/>
+      </w:pPr>
+      <w:r>
+        <w:t xml:space="preserve">8.2 Sortie obtenue (test1_exemple_sujet.txt)</w:t>
+      </w:r>
+    </w:p>
+    <w:p>
+      <w:pPr>
+        <w:shd w:fill="F2F2F2" w:val="clear"/>
+        <w:spacing w:after="0"/>
+      </w:pPr>
+      <w:r>
+        <w:rPr>
+          <w:rFonts w:ascii="Consolas" w:cs="Consolas" w:eastAsia="Consolas" w:hAnsi="Consolas"/>
+          <w:sz w:val="18"/>
+          <w:szCs w:val="18"/>
+        </w:rPr>
+        <w:t xml:space="preserve">=== Analyse lexicale — instrumentation (type : lexeme) ===</w:t>
+      </w:r>
+    </w:p>
+    <w:p>
+      <w:pPr>
+        <w:shd w:fill="F2F2F2" w:val="clear"/>
+        <w:spacing w:after="0"/>
+      </w:pPr>
+      <w:r>
+        <w:rPr>
+          <w:rFonts w:ascii="Consolas" w:cs="Consolas" w:eastAsia="Consolas" w:hAnsi="Consolas"/>
+          <w:sz w:val="18"/>
+          <w:szCs w:val="18"/>
+        </w:rPr>
+        <w:t xml:space="preserve">Fichier : test1_exemple_sujet.txt</w:t>
+      </w:r>
+    </w:p>
+    <w:p>
+      <w:pPr>
+        <w:shd w:fill="F2F2F2" w:val="clear"/>
+        <w:spacing w:after="0"/>
+      </w:pPr>
+      <w:r>
+        <w:rPr>
+          <w:rFonts w:ascii="Consolas" w:cs="Consolas" w:eastAsia="Consolas" w:hAnsi="Consolas"/>
+          <w:sz w:val="18"/>
+          <w:szCs w:val="18"/>
+        </w:rPr>
+        <w:t xml:space="preserve">  [TITRE : "Monsieur"]</w:t>
+      </w:r>
+    </w:p>
+    <w:p>
+      <w:pPr>
+        <w:shd w:fill="F2F2F2" w:val="clear"/>
+        <w:spacing w:after="0"/>
+      </w:pPr>
+      <w:r>
+        <w:rPr>
+          <w:rFonts w:ascii="Consolas" w:cs="Consolas" w:eastAsia="Consolas" w:hAnsi="Consolas"/>
+          <w:sz w:val="18"/>
+          <w:szCs w:val="18"/>
+        </w:rPr>
+        <w:t xml:space="preserve">  [PERSONNE : "Amadou"]</w:t>
+      </w:r>
+    </w:p>
+    <w:p>
+      <w:pPr>
+        <w:shd w:fill="F2F2F2" w:val="clear"/>
+        <w:spacing w:after="0"/>
+      </w:pPr>
+      <w:r>
+        <w:rPr>
+          <w:rFonts w:ascii="Consolas" w:cs="Consolas" w:eastAsia="Consolas" w:hAnsi="Consolas"/>
+          <w:sz w:val="18"/>
+          <w:szCs w:val="18"/>
+        </w:rPr>
+        <w:t xml:space="preserve">  [PERSONNE : "Diallo"]</w:t>
+      </w:r>
+    </w:p>
+    <w:p>
+      <w:pPr>
+        <w:shd w:fill="F2F2F2" w:val="clear"/>
+        <w:spacing w:after="0"/>
+      </w:pPr>
+      <w:r>
+        <w:rPr>
+          <w:rFonts w:ascii="Consolas" w:cs="Consolas" w:eastAsia="Consolas" w:hAnsi="Consolas"/>
+          <w:sz w:val="18"/>
+          <w:szCs w:val="18"/>
+        </w:rPr>
+        <w:t xml:space="preserve">  [MOT : "est"] [MOT : "joignable"] [MOT : "au"]</w:t>
+      </w:r>
+    </w:p>
+    <w:p>
+      <w:pPr>
+        <w:shd w:fill="F2F2F2" w:val="clear"/>
+        <w:spacing w:after="0"/>
+      </w:pPr>
+      <w:r>
+        <w:rPr>
+          <w:rFonts w:ascii="Consolas" w:cs="Consolas" w:eastAsia="Consolas" w:hAnsi="Consolas"/>
+          <w:sz w:val="18"/>
+          <w:szCs w:val="18"/>
+        </w:rPr>
+        <w:t xml:space="preserve">  [TELEPHONE : "77 123 45 67"]</w:t>
+      </w:r>
+    </w:p>
+    <w:p>
+      <w:pPr>
+        <w:shd w:fill="F2F2F2" w:val="clear"/>
+        <w:spacing w:after="0"/>
+      </w:pPr>
+      <w:r>
+        <w:rPr>
+          <w:rFonts w:ascii="Consolas" w:cs="Consolas" w:eastAsia="Consolas" w:hAnsi="Consolas"/>
+          <w:sz w:val="18"/>
+          <w:szCs w:val="18"/>
+        </w:rPr>
+        <w:t xml:space="preserve">  [PERSONNE : "Son"] [MOT : "adresse"] [MOT : "est"]</w:t>
+      </w:r>
+    </w:p>
+    <w:p>
+      <w:pPr>
+        <w:shd w:fill="F2F2F2" w:val="clear"/>
+        <w:spacing w:after="0"/>
+      </w:pPr>
+      <w:r>
+        <w:rPr>
+          <w:rFonts w:ascii="Consolas" w:cs="Consolas" w:eastAsia="Consolas" w:hAnsi="Consolas"/>
+          <w:sz w:val="18"/>
+          <w:szCs w:val="18"/>
+        </w:rPr>
+        <w:t xml:space="preserve">  [EMAIL : "amadou.diallo@gmail.com"]</w:t>
+      </w:r>
+    </w:p>
+    <w:p>
+      <w:pPr>
+        <w:shd w:fill="F2F2F2" w:val="clear"/>
+        <w:spacing w:after="0"/>
+      </w:pPr>
+      <w:r>
+        <w:rPr>
+          <w:rFonts w:ascii="Consolas" w:cs="Consolas" w:eastAsia="Consolas" w:hAnsi="Consolas"/>
+          <w:sz w:val="18"/>
+          <w:szCs w:val="18"/>
+        </w:rPr>
+        <w:t xml:space="preserve">  [PERSONNE : "Le"] [MOT : "paiement"] [MOT : "de"]</w:t>
+      </w:r>
+    </w:p>
+    <w:p>
+      <w:pPr>
+        <w:shd w:fill="F2F2F2" w:val="clear"/>
+        <w:spacing w:after="0"/>
+      </w:pPr>
+      <w:r>
+        <w:rPr>
+          <w:rFonts w:ascii="Consolas" w:cs="Consolas" w:eastAsia="Consolas" w:hAnsi="Consolas"/>
+          <w:sz w:val="18"/>
+          <w:szCs w:val="18"/>
+        </w:rPr>
+        <w:t xml:space="preserve">  [MONTANT : "250000 FCFA"]</w:t>
+      </w:r>
+    </w:p>
+    <w:p>
+      <w:pPr>
+        <w:shd w:fill="F2F2F2" w:val="clear"/>
+        <w:spacing w:after="0"/>
+      </w:pPr>
+      <w:r>
+        <w:rPr>
+          <w:rFonts w:ascii="Consolas" w:cs="Consolas" w:eastAsia="Consolas" w:hAnsi="Consolas"/>
+          <w:sz w:val="18"/>
+          <w:szCs w:val="18"/>
+        </w:rPr>
+        <w:t xml:space="preserve">  [MOT : "a"] [MOT : "été"] [MOT : "effectué"] [MOT : "le"]</w:t>
+      </w:r>
+    </w:p>
+    <w:p>
+      <w:pPr>
+        <w:shd w:fill="F2F2F2" w:val="clear"/>
+        <w:spacing w:after="0"/>
+      </w:pPr>
+      <w:r>
+        <w:rPr>
+          <w:rFonts w:ascii="Consolas" w:cs="Consolas" w:eastAsia="Consolas" w:hAnsi="Consolas"/>
+          <w:sz w:val="18"/>
+          <w:szCs w:val="18"/>
+        </w:rPr>
+        <w:t xml:space="preserve">  [DATE : "15/06/2026"]</w:t>
+      </w:r>
+    </w:p>
+    <w:p>
+      <w:pPr>
+        <w:shd w:fill="F2F2F2" w:val="clear"/>
+        <w:spacing w:after="200"/>
+      </w:pPr>
+      <w:r>
+        <w:rPr>
+          <w:rFonts w:ascii="Consolas" w:cs="Consolas" w:eastAsia="Consolas" w:hAnsi="Consolas"/>
+          <w:sz w:val="18"/>
+          <w:szCs w:val="18"/>
+        </w:rPr>
+        <w:t xml:space="preserve">Total : 23 tokens significatifs.</w:t>
+      </w:r>
+    </w:p>
+    <w:p>
+      <w:pPr>
+        <w:spacing w:after="160"/>
+      </w:pPr>
+      <w:r>
+        <w:t xml:space="preserve">Les cinq catégories sensibles sont isolées avec le bon type. « Son » et « Le » sont classés PERSONNE par le lexer (majuscule initiale) : c'est l'ambiguïté de tête de phrase (Partie 5), levée à l'anonymisation par le lexique de mots outils — ils sont finalement conservés dans le texte de sortie.</w:t>
       </w:r>
     </w:p>
     <w:p>
@@ -907,28 +4001,6 @@
         <w:pStyle w:val="Heading1"/>
       </w:pPr>
       <w:r>
-        <w:t xml:space="preserve">Partie 8 — Instrumentation</w:t>
-      </w:r>
-    </w:p>
-    <w:p>
-      <w:pPr>
-        <w:shd w:fill="FFF2CC" w:val="clear"/>
-        <w:spacing w:after="200"/>
-      </w:pPr>
-      <w:r>
-        <w:rPr>
-          <w:i/>
-          <w:iCs/>
-          <w:color w:val="7F6000"/>
-        </w:rPr>
-        <w:t xml:space="preserve">À COMPLÉTER — Membre 2 — présenter l'affichage du type de token et du lexème reconnu (capture d'écran ou extrait de sortie console).</w:t>
-      </w:r>
-    </w:p>
-    <w:p>
-      <w:pPr>
-        <w:pStyle w:val="Heading1"/>
-      </w:pPr>
-      <w:r>
         <w:t xml:space="preserve">Partie 9 — Validation</w:t>
       </w:r>
     </w:p>
@@ -937,21 +4009,563 @@
         <w:spacing w:after="160"/>
       </w:pPr>
       <w:r>
-        <w:t xml:space="preserve">Un jeu de 5 fichiers de test a été constitué dans test/input/, couvrant : l'exemple du sujet, plusieurs personnes/emails, formats de téléphone variés, formats de date/montant variés, et des cas pièges (majuscule en début de phrase, accents, apostrophes, noms composés).</w:t>
-      </w:r>
-    </w:p>
-    <w:p>
-      <w:pPr>
-        <w:shd w:fill="FFF2CC" w:val="clear"/>
-        <w:spacing w:after="200"/>
-      </w:pPr>
-      <w:r>
-        <w:rPr>
-          <w:i/>
-          <w:iCs/>
-          <w:color w:val="7F6000"/>
-        </w:rPr>
-        <w:t xml:space="preserve">À COMPLÉTER — Membre 3 — exécuter le programme sur l'ensemble des documents de test et construire le tableau récapitulatif des résultats (fichier testé / anonymisation attendue / anonymisation obtenue / conforme ou non).</w:t>
+        <w:t xml:space="preserve">Un jeu de 5 fichiers de test a été constitué dans test/input/, couvrant : l'exemple du sujet, plusieurs personnes/emails, formats de téléphone variés, formats de date/montant variés, et des cas pièges (majuscule en début de phrase, accents, apostrophes, noms composés). Le programme complet (lexer JavaCC de M2 + pipeline M3) a été compilé et exécuté sur les 5 fichiers.</w:t>
+      </w:r>
+    </w:p>
+    <w:p>
+      <w:pPr>
+        <w:pStyle w:val="Heading2"/>
+      </w:pPr>
+      <w:r>
+        <w:t xml:space="preserve">9.1 Tableau récapitulatif</w:t>
+      </w:r>
+    </w:p>
+    <w:tbl>
+      <w:tblPr>
+        <w:tblW w:type="dxa" w:w="9360"/>
+        <w:tblBorders>
+          <w:top w:val="single" w:color="auto" w:sz="4"/>
+          <w:left w:val="single" w:color="auto" w:sz="4"/>
+          <w:bottom w:val="single" w:color="auto" w:sz="4"/>
+          <w:right w:val="single" w:color="auto" w:sz="4"/>
+          <w:insideH w:val="single" w:color="auto" w:sz="4"/>
+          <w:insideV w:val="single" w:color="auto" w:sz="4"/>
+        </w:tblBorders>
+      </w:tblPr>
+      <w:tblGrid>
+        <w:gridCol w:w="2600"/>
+        <w:gridCol w:w="1400"/>
+        <w:gridCol w:w="5360"/>
+      </w:tblGrid>
+      <w:tr>
+        <w:tc>
+          <w:tcPr>
+            <w:tcW w:type="dxa" w:w="2600"/>
+            <w:tcBorders>
+              <w:top w:val="single" w:color="CCCCCC" w:sz="1"/>
+              <w:left w:val="single" w:color="CCCCCC" w:sz="1"/>
+              <w:bottom w:val="single" w:color="CCCCCC" w:sz="1"/>
+              <w:right w:val="single" w:color="CCCCCC" w:sz="1"/>
+            </w:tcBorders>
+            <w:shd w:fill="1F3864" w:val="clear"/>
+            <w:tcMar>
+              <w:top w:type="dxa" w:w="80"/>
+              <w:left w:type="dxa" w:w="120"/>
+              <w:bottom w:type="dxa" w:w="80"/>
+              <w:right w:type="dxa" w:w="120"/>
+            </w:tcMar>
+          </w:tcPr>
+          <w:p>
+            <w:r>
+              <w:rPr>
+                <w:b/>
+                <w:bCs/>
+                <w:color w:val="FFFFFF"/>
+                <w:sz w:val="20"/>
+                <w:szCs w:val="20"/>
+              </w:rPr>
+              <w:t xml:space="preserve">Fichier</w:t>
+            </w:r>
+          </w:p>
+        </w:tc>
+        <w:tc>
+          <w:tcPr>
+            <w:tcW w:type="dxa" w:w="1400"/>
+            <w:tcBorders>
+              <w:top w:val="single" w:color="CCCCCC" w:sz="1"/>
+              <w:left w:val="single" w:color="CCCCCC" w:sz="1"/>
+              <w:bottom w:val="single" w:color="CCCCCC" w:sz="1"/>
+              <w:right w:val="single" w:color="CCCCCC" w:sz="1"/>
+            </w:tcBorders>
+            <w:shd w:fill="1F3864" w:val="clear"/>
+            <w:tcMar>
+              <w:top w:type="dxa" w:w="80"/>
+              <w:left w:type="dxa" w:w="120"/>
+              <w:bottom w:type="dxa" w:w="80"/>
+              <w:right w:type="dxa" w:w="120"/>
+            </w:tcMar>
+          </w:tcPr>
+          <w:p>
+            <w:r>
+              <w:rPr>
+                <w:b/>
+                <w:bCs/>
+                <w:color w:val="FFFFFF"/>
+                <w:sz w:val="20"/>
+                <w:szCs w:val="20"/>
+              </w:rPr>
+              <w:t xml:space="preserve">Tokens</w:t>
+            </w:r>
+          </w:p>
+        </w:tc>
+        <w:tc>
+          <w:tcPr>
+            <w:tcW w:type="dxa" w:w="5360"/>
+            <w:tcBorders>
+              <w:top w:val="single" w:color="CCCCCC" w:sz="1"/>
+              <w:left w:val="single" w:color="CCCCCC" w:sz="1"/>
+              <w:bottom w:val="single" w:color="CCCCCC" w:sz="1"/>
+              <w:right w:val="single" w:color="CCCCCC" w:sz="1"/>
+            </w:tcBorders>
+            <w:shd w:fill="1F3864" w:val="clear"/>
+            <w:tcMar>
+              <w:top w:type="dxa" w:w="80"/>
+              <w:left w:type="dxa" w:w="120"/>
+              <w:bottom w:type="dxa" w:w="80"/>
+              <w:right w:type="dxa" w:w="120"/>
+            </w:tcMar>
+          </w:tcPr>
+          <w:p>
+            <w:r>
+              <w:rPr>
+                <w:b/>
+                <w:bCs/>
+                <w:color w:val="FFFFFF"/>
+                <w:sz w:val="20"/>
+                <w:szCs w:val="20"/>
+              </w:rPr>
+              <w:t xml:space="preserve">Catégories détectées / résultat</w:t>
+            </w:r>
+          </w:p>
+        </w:tc>
+      </w:tr>
+      <w:tr>
+        <w:tc>
+          <w:tcPr>
+            <w:tcW w:type="dxa" w:w="2600"/>
+            <w:tcBorders>
+              <w:top w:val="single" w:color="CCCCCC" w:sz="1"/>
+              <w:left w:val="single" w:color="CCCCCC" w:sz="1"/>
+              <w:bottom w:val="single" w:color="CCCCCC" w:sz="1"/>
+              <w:right w:val="single" w:color="CCCCCC" w:sz="1"/>
+            </w:tcBorders>
+            <w:tcMar>
+              <w:top w:type="dxa" w:w="80"/>
+              <w:left w:type="dxa" w:w="120"/>
+              <w:bottom w:type="dxa" w:w="80"/>
+              <w:right w:type="dxa" w:w="120"/>
+            </w:tcMar>
+          </w:tcPr>
+          <w:p>
+            <w:r>
+              <w:rPr>
+                <w:b w:val="false"/>
+                <w:bCs w:val="false"/>
+                <w:sz w:val="20"/>
+                <w:szCs w:val="20"/>
+              </w:rPr>
+              <w:t xml:space="preserve">test1_exemple_sujet.txt</w:t>
+            </w:r>
+          </w:p>
+        </w:tc>
+        <w:tc>
+          <w:tcPr>
+            <w:tcW w:type="dxa" w:w="1400"/>
+            <w:tcBorders>
+              <w:top w:val="single" w:color="CCCCCC" w:sz="1"/>
+              <w:left w:val="single" w:color="CCCCCC" w:sz="1"/>
+              <w:bottom w:val="single" w:color="CCCCCC" w:sz="1"/>
+              <w:right w:val="single" w:color="CCCCCC" w:sz="1"/>
+            </w:tcBorders>
+            <w:tcMar>
+              <w:top w:type="dxa" w:w="80"/>
+              <w:left w:type="dxa" w:w="120"/>
+              <w:bottom w:type="dxa" w:w="80"/>
+              <w:right w:type="dxa" w:w="120"/>
+            </w:tcMar>
+          </w:tcPr>
+          <w:p>
+            <w:r>
+              <w:rPr>
+                <w:b w:val="false"/>
+                <w:bCs w:val="false"/>
+                <w:sz w:val="20"/>
+                <w:szCs w:val="20"/>
+              </w:rPr>
+              <w:t xml:space="preserve">23</w:t>
+            </w:r>
+          </w:p>
+        </w:tc>
+        <w:tc>
+          <w:tcPr>
+            <w:tcW w:type="dxa" w:w="5360"/>
+            <w:tcBorders>
+              <w:top w:val="single" w:color="CCCCCC" w:sz="1"/>
+              <w:left w:val="single" w:color="CCCCCC" w:sz="1"/>
+              <w:bottom w:val="single" w:color="CCCCCC" w:sz="1"/>
+              <w:right w:val="single" w:color="CCCCCC" w:sz="1"/>
+            </w:tcBorders>
+            <w:tcMar>
+              <w:top w:type="dxa" w:w="80"/>
+              <w:left w:type="dxa" w:w="120"/>
+              <w:bottom w:type="dxa" w:w="80"/>
+              <w:right w:type="dxa" w:w="120"/>
+            </w:tcMar>
+          </w:tcPr>
+          <w:p>
+            <w:r>
+              <w:rPr>
+                <w:b w:val="false"/>
+                <w:bCs w:val="false"/>
+                <w:sz w:val="20"/>
+                <w:szCs w:val="20"/>
+              </w:rPr>
+              <w:t xml:space="preserve">TITLE 1, PERSON 4, WORD 11, PHONE 1, EMAIL 1, AMOUNT 1, DATE 1 — anonymisation conforme à l'exemple du sujet.</w:t>
+            </w:r>
+          </w:p>
+        </w:tc>
+      </w:tr>
+      <w:tr>
+        <w:tc>
+          <w:tcPr>
+            <w:tcW w:type="dxa" w:w="2600"/>
+            <w:tcBorders>
+              <w:top w:val="single" w:color="CCCCCC" w:sz="1"/>
+              <w:left w:val="single" w:color="CCCCCC" w:sz="1"/>
+              <w:bottom w:val="single" w:color="CCCCCC" w:sz="1"/>
+              <w:right w:val="single" w:color="CCCCCC" w:sz="1"/>
+            </w:tcBorders>
+            <w:tcMar>
+              <w:top w:type="dxa" w:w="80"/>
+              <w:left w:type="dxa" w:w="120"/>
+              <w:bottom w:type="dxa" w:w="80"/>
+              <w:right w:type="dxa" w:w="120"/>
+            </w:tcMar>
+          </w:tcPr>
+          <w:p>
+            <w:r>
+              <w:rPr>
+                <w:b w:val="false"/>
+                <w:bCs w:val="false"/>
+                <w:sz w:val="20"/>
+                <w:szCs w:val="20"/>
+              </w:rPr>
+              <w:t xml:space="preserve">test2_personnes_emails.txt</w:t>
+            </w:r>
+          </w:p>
+        </w:tc>
+        <w:tc>
+          <w:tcPr>
+            <w:tcW w:type="dxa" w:w="1400"/>
+            <w:tcBorders>
+              <w:top w:val="single" w:color="CCCCCC" w:sz="1"/>
+              <w:left w:val="single" w:color="CCCCCC" w:sz="1"/>
+              <w:bottom w:val="single" w:color="CCCCCC" w:sz="1"/>
+              <w:right w:val="single" w:color="CCCCCC" w:sz="1"/>
+            </w:tcBorders>
+            <w:tcMar>
+              <w:top w:type="dxa" w:w="80"/>
+              <w:left w:type="dxa" w:w="120"/>
+              <w:bottom w:type="dxa" w:w="80"/>
+              <w:right w:type="dxa" w:w="120"/>
+            </w:tcMar>
+          </w:tcPr>
+          <w:p>
+            <w:r>
+              <w:rPr>
+                <w:b w:val="false"/>
+                <w:bCs w:val="false"/>
+                <w:sz w:val="20"/>
+                <w:szCs w:val="20"/>
+              </w:rPr>
+              <w:t xml:space="preserve">42</w:t>
+            </w:r>
+          </w:p>
+        </w:tc>
+        <w:tc>
+          <w:tcPr>
+            <w:tcW w:type="dxa" w:w="5360"/>
+            <w:tcBorders>
+              <w:top w:val="single" w:color="CCCCCC" w:sz="1"/>
+              <w:left w:val="single" w:color="CCCCCC" w:sz="1"/>
+              <w:bottom w:val="single" w:color="CCCCCC" w:sz="1"/>
+              <w:right w:val="single" w:color="CCCCCC" w:sz="1"/>
+            </w:tcBorders>
+            <w:tcMar>
+              <w:top w:type="dxa" w:w="80"/>
+              <w:left w:type="dxa" w:w="120"/>
+              <w:bottom w:type="dxa" w:w="80"/>
+              <w:right w:type="dxa" w:w="120"/>
+            </w:tcMar>
+          </w:tcPr>
+          <w:p>
+            <w:r>
+              <w:rPr>
+                <w:b w:val="false"/>
+                <w:bCs w:val="false"/>
+                <w:sz w:val="20"/>
+                <w:szCs w:val="20"/>
+              </w:rPr>
+              <w:t xml:space="preserve">TITLE 2, PERSON 14, WORD 16, EMAIL 3 — noms composés (« Cheikh Anta Diop ») bien regroupés par PersonName.</w:t>
+            </w:r>
+          </w:p>
+        </w:tc>
+      </w:tr>
+      <w:tr>
+        <w:tc>
+          <w:tcPr>
+            <w:tcW w:type="dxa" w:w="2600"/>
+            <w:tcBorders>
+              <w:top w:val="single" w:color="CCCCCC" w:sz="1"/>
+              <w:left w:val="single" w:color="CCCCCC" w:sz="1"/>
+              <w:bottom w:val="single" w:color="CCCCCC" w:sz="1"/>
+              <w:right w:val="single" w:color="CCCCCC" w:sz="1"/>
+            </w:tcBorders>
+            <w:tcMar>
+              <w:top w:type="dxa" w:w="80"/>
+              <w:left w:type="dxa" w:w="120"/>
+              <w:bottom w:type="dxa" w:w="80"/>
+              <w:right w:type="dxa" w:w="120"/>
+            </w:tcMar>
+          </w:tcPr>
+          <w:p>
+            <w:r>
+              <w:rPr>
+                <w:b w:val="false"/>
+                <w:bCs w:val="false"/>
+                <w:sz w:val="20"/>
+                <w:szCs w:val="20"/>
+              </w:rPr>
+              <w:t xml:space="preserve">test3_telephones.txt</w:t>
+            </w:r>
+          </w:p>
+        </w:tc>
+        <w:tc>
+          <w:tcPr>
+            <w:tcW w:type="dxa" w:w="1400"/>
+            <w:tcBorders>
+              <w:top w:val="single" w:color="CCCCCC" w:sz="1"/>
+              <w:left w:val="single" w:color="CCCCCC" w:sz="1"/>
+              <w:bottom w:val="single" w:color="CCCCCC" w:sz="1"/>
+              <w:right w:val="single" w:color="CCCCCC" w:sz="1"/>
+            </w:tcBorders>
+            <w:tcMar>
+              <w:top w:type="dxa" w:w="80"/>
+              <w:left w:type="dxa" w:w="120"/>
+              <w:bottom w:type="dxa" w:w="80"/>
+              <w:right w:type="dxa" w:w="120"/>
+            </w:tcMar>
+          </w:tcPr>
+          <w:p>
+            <w:r>
+              <w:rPr>
+                <w:b w:val="false"/>
+                <w:bCs w:val="false"/>
+                <w:sz w:val="20"/>
+                <w:szCs w:val="20"/>
+              </w:rPr>
+              <w:t xml:space="preserve">27</w:t>
+            </w:r>
+          </w:p>
+        </w:tc>
+        <w:tc>
+          <w:tcPr>
+            <w:tcW w:type="dxa" w:w="5360"/>
+            <w:tcBorders>
+              <w:top w:val="single" w:color="CCCCCC" w:sz="1"/>
+              <w:left w:val="single" w:color="CCCCCC" w:sz="1"/>
+              <w:bottom w:val="single" w:color="CCCCCC" w:sz="1"/>
+              <w:right w:val="single" w:color="CCCCCC" w:sz="1"/>
+            </w:tcBorders>
+            <w:tcMar>
+              <w:top w:type="dxa" w:w="80"/>
+              <w:left w:type="dxa" w:w="120"/>
+              <w:bottom w:type="dxa" w:w="80"/>
+              <w:right w:type="dxa" w:w="120"/>
+            </w:tcMar>
+          </w:tcPr>
+          <w:p>
+            <w:r>
+              <w:rPr>
+                <w:b w:val="false"/>
+                <w:bCs w:val="false"/>
+                <w:sz w:val="20"/>
+                <w:szCs w:val="20"/>
+              </w:rPr>
+              <w:t xml:space="preserve">PERSON 6, WORD 10, PHONE 5 — tous les formats de téléphone (espaces, tirets, +221, accolé) anonymisés.</w:t>
+            </w:r>
+          </w:p>
+        </w:tc>
+      </w:tr>
+      <w:tr>
+        <w:tc>
+          <w:tcPr>
+            <w:tcW w:type="dxa" w:w="2600"/>
+            <w:tcBorders>
+              <w:top w:val="single" w:color="CCCCCC" w:sz="1"/>
+              <w:left w:val="single" w:color="CCCCCC" w:sz="1"/>
+              <w:bottom w:val="single" w:color="CCCCCC" w:sz="1"/>
+              <w:right w:val="single" w:color="CCCCCC" w:sz="1"/>
+            </w:tcBorders>
+            <w:tcMar>
+              <w:top w:type="dxa" w:w="80"/>
+              <w:left w:type="dxa" w:w="120"/>
+              <w:bottom w:type="dxa" w:w="80"/>
+              <w:right w:type="dxa" w:w="120"/>
+            </w:tcMar>
+          </w:tcPr>
+          <w:p>
+            <w:r>
+              <w:rPr>
+                <w:b w:val="false"/>
+                <w:bCs w:val="false"/>
+                <w:sz w:val="20"/>
+                <w:szCs w:val="20"/>
+              </w:rPr>
+              <w:t xml:space="preserve">test4_dates_montants.txt</w:t>
+            </w:r>
+          </w:p>
+        </w:tc>
+        <w:tc>
+          <w:tcPr>
+            <w:tcW w:type="dxa" w:w="1400"/>
+            <w:tcBorders>
+              <w:top w:val="single" w:color="CCCCCC" w:sz="1"/>
+              <w:left w:val="single" w:color="CCCCCC" w:sz="1"/>
+              <w:bottom w:val="single" w:color="CCCCCC" w:sz="1"/>
+              <w:right w:val="single" w:color="CCCCCC" w:sz="1"/>
+            </w:tcBorders>
+            <w:tcMar>
+              <w:top w:type="dxa" w:w="80"/>
+              <w:left w:type="dxa" w:w="120"/>
+              <w:bottom w:type="dxa" w:w="80"/>
+              <w:right w:type="dxa" w:w="120"/>
+            </w:tcMar>
+          </w:tcPr>
+          <w:p>
+            <w:r>
+              <w:rPr>
+                <w:b w:val="false"/>
+                <w:bCs w:val="false"/>
+                <w:sz w:val="20"/>
+                <w:szCs w:val="20"/>
+              </w:rPr>
+              <w:t xml:space="preserve">45</w:t>
+            </w:r>
+          </w:p>
+        </w:tc>
+        <w:tc>
+          <w:tcPr>
+            <w:tcW w:type="dxa" w:w="5360"/>
+            <w:tcBorders>
+              <w:top w:val="single" w:color="CCCCCC" w:sz="1"/>
+              <w:left w:val="single" w:color="CCCCCC" w:sz="1"/>
+              <w:bottom w:val="single" w:color="CCCCCC" w:sz="1"/>
+              <w:right w:val="single" w:color="CCCCCC" w:sz="1"/>
+            </w:tcBorders>
+            <w:tcMar>
+              <w:top w:type="dxa" w:w="80"/>
+              <w:left w:type="dxa" w:w="120"/>
+              <w:bottom w:type="dxa" w:w="80"/>
+              <w:right w:type="dxa" w:w="120"/>
+            </w:tcMar>
+          </w:tcPr>
+          <w:p>
+            <w:r>
+              <w:rPr>
+                <w:b w:val="false"/>
+                <w:bCs w:val="false"/>
+                <w:sz w:val="20"/>
+                <w:szCs w:val="20"/>
+              </w:rPr>
+              <w:t xml:space="preserve">PERSON 4, WORD 28, DATE 5, AMOUNT 3 — tous les formats de date/montant testés (JJ/MM/AAAA, JJ-MM-AAAA, AAAA/MM/JJ, séparateurs de milliers) anonymisés.</w:t>
+            </w:r>
+          </w:p>
+        </w:tc>
+      </w:tr>
+      <w:tr>
+        <w:tc>
+          <w:tcPr>
+            <w:tcW w:type="dxa" w:w="2600"/>
+            <w:tcBorders>
+              <w:top w:val="single" w:color="CCCCCC" w:sz="1"/>
+              <w:left w:val="single" w:color="CCCCCC" w:sz="1"/>
+              <w:bottom w:val="single" w:color="CCCCCC" w:sz="1"/>
+              <w:right w:val="single" w:color="CCCCCC" w:sz="1"/>
+            </w:tcBorders>
+            <w:tcMar>
+              <w:top w:type="dxa" w:w="80"/>
+              <w:left w:type="dxa" w:w="120"/>
+              <w:bottom w:type="dxa" w:w="80"/>
+              <w:right w:type="dxa" w:w="120"/>
+            </w:tcMar>
+          </w:tcPr>
+          <w:p>
+            <w:r>
+              <w:rPr>
+                <w:b w:val="false"/>
+                <w:bCs w:val="false"/>
+                <w:sz w:val="20"/>
+                <w:szCs w:val="20"/>
+              </w:rPr>
+              <w:t xml:space="preserve">test5_cas_difficiles.txt</w:t>
+            </w:r>
+          </w:p>
+        </w:tc>
+        <w:tc>
+          <w:tcPr>
+            <w:tcW w:type="dxa" w:w="1400"/>
+            <w:tcBorders>
+              <w:top w:val="single" w:color="CCCCCC" w:sz="1"/>
+              <w:left w:val="single" w:color="CCCCCC" w:sz="1"/>
+              <w:bottom w:val="single" w:color="CCCCCC" w:sz="1"/>
+              <w:right w:val="single" w:color="CCCCCC" w:sz="1"/>
+            </w:tcBorders>
+            <w:tcMar>
+              <w:top w:type="dxa" w:w="80"/>
+              <w:left w:type="dxa" w:w="120"/>
+              <w:bottom w:type="dxa" w:w="80"/>
+              <w:right w:type="dxa" w:w="120"/>
+            </w:tcMar>
+          </w:tcPr>
+          <w:p>
+            <w:r>
+              <w:rPr>
+                <w:b w:val="false"/>
+                <w:bCs w:val="false"/>
+                <w:sz w:val="20"/>
+                <w:szCs w:val="20"/>
+              </w:rPr>
+              <w:t xml:space="preserve">59</w:t>
+            </w:r>
+          </w:p>
+        </w:tc>
+        <w:tc>
+          <w:tcPr>
+            <w:tcW w:type="dxa" w:w="5360"/>
+            <w:tcBorders>
+              <w:top w:val="single" w:color="CCCCCC" w:sz="1"/>
+              <w:left w:val="single" w:color="CCCCCC" w:sz="1"/>
+              <w:bottom w:val="single" w:color="CCCCCC" w:sz="1"/>
+              <w:right w:val="single" w:color="CCCCCC" w:sz="1"/>
+            </w:tcBorders>
+            <w:tcMar>
+              <w:top w:type="dxa" w:w="80"/>
+              <w:left w:type="dxa" w:w="120"/>
+              <w:bottom w:type="dxa" w:w="80"/>
+              <w:right w:type="dxa" w:w="120"/>
+            </w:tcMar>
+          </w:tcPr>
+          <w:p>
+            <w:r>
+              <w:rPr>
+                <w:b w:val="false"/>
+                <w:bCs w:val="false"/>
+                <w:sz w:val="20"/>
+                <w:szCs w:val="20"/>
+              </w:rPr>
+              <w:t xml:space="preserve">PERSON 15, WORD 31, DATE 1, TITLE 1, EMAIL 1, NUMBER 1 — cas pièges : « Sénégal » et « Dakar » anonymisés à tort en &lt;PERSONNE&gt; (limite, voir Partie 10) ; apostrophes et mots composés correctement conservés en WORD.</w:t>
+            </w:r>
+          </w:p>
+        </w:tc>
+      </w:tr>
+    </w:tbl>
+    <w:p>
+      <w:pPr>
+        <w:spacing w:after="160"/>
+      </w:pPr>
+      <w:r>
+        <w:t xml:space="preserve">Détail : cf. Partie 8 pour la sortie d'instrumentation complète, et les fichiers test/output/*_anonymise.txt pour le texte anonymisé produit sur chacun des 5 documents.</w:t>
       </w:r>
     </w:p>
     <w:p>

</xml_diff>